<commit_message>
updates docs, deploys system and updates readme :strong:
</commit_message>
<xml_diff>
--- a/docs/PITCH.docx
+++ b/docs/PITCH.docx
@@ -5,28 +5,81 @@
     <w:p>
       <w:pPr>
         <w:pStyle w:val="Title"/>
-      </w:pPr>
-      <w:r>
-        <w:t>Global Health Observatory — Project Pitch</w:t>
+        <w:rPr>
+          <w:rFonts w:ascii="Times New Roman" w:hAnsi="Times New Roman" w:cs="Times New Roman"/>
+        </w:rPr>
+      </w:pPr>
+      <w:r>
+        <w:rPr>
+          <w:rFonts w:ascii="Times New Roman" w:hAnsi="Times New Roman" w:cs="Times New Roman"/>
+        </w:rPr>
+        <w:t>Global Health Observatory — Phase 2 Pitch</w:t>
       </w:r>
     </w:p>
     <w:p>
       <w:pPr>
         <w:pStyle w:val="Heading1"/>
         <w:jc w:val="both"/>
-      </w:pPr>
-      <w:bookmarkStart w:id="0" w:name="global-health-observatory-pitch"/>
-      <w:r>
-        <w:t>Global Health Observatory — Pitch</w:t>
+        <w:rPr>
+          <w:rFonts w:ascii="Times New Roman" w:hAnsi="Times New Roman" w:cs="Times New Roman"/>
+        </w:rPr>
+      </w:pPr>
+      <w:bookmarkStart w:id="0" w:name="global-health-observatory-phase-2-pitch"/>
+      <w:r>
+        <w:rPr>
+          <w:rFonts w:ascii="Times New Roman" w:hAnsi="Times New Roman" w:cs="Times New Roman"/>
+        </w:rPr>
+        <w:t>Global Health Observatory — Phase 2 Pitch</w:t>
+      </w:r>
+    </w:p>
+    <w:p>
+      <w:pPr>
+        <w:pStyle w:val="FirstParagraph"/>
+        <w:jc w:val="both"/>
+        <w:rPr>
+          <w:rFonts w:ascii="Times New Roman" w:hAnsi="Times New Roman" w:cs="Times New Roman"/>
+          <w:i/>
+          <w:iCs/>
+        </w:rPr>
+      </w:pPr>
+      <w:r>
+        <w:rPr>
+          <w:rFonts w:ascii="Times New Roman" w:hAnsi="Times New Roman" w:cs="Times New Roman"/>
+          <w:i/>
+          <w:iCs/>
+        </w:rPr>
+        <w:t>Extending our Phase 1 React app with a Flask + PostgreSQL backend.</w:t>
       </w:r>
     </w:p>
     <w:p>
       <w:pPr>
         <w:pStyle w:val="Heading2"/>
         <w:jc w:val="both"/>
-      </w:pPr>
-      <w:bookmarkStart w:id="1" w:name="the-problem"/>
-      <w:r>
+        <w:rPr>
+          <w:rFonts w:ascii="Times New Roman" w:hAnsi="Times New Roman" w:cs="Times New Roman"/>
+        </w:rPr>
+      </w:pPr>
+      <w:bookmarkStart w:id="1" w:name="step-1-business-problem-scenario"/>
+      <w:r>
+        <w:rPr>
+          <w:rFonts w:ascii="Times New Roman" w:hAnsi="Times New Roman" w:cs="Times New Roman"/>
+        </w:rPr>
+        <w:t>Business Problem Scenario</w:t>
+      </w:r>
+    </w:p>
+    <w:p>
+      <w:pPr>
+        <w:pStyle w:val="Heading3"/>
+        <w:jc w:val="both"/>
+        <w:rPr>
+          <w:rFonts w:ascii="Times New Roman" w:hAnsi="Times New Roman" w:cs="Times New Roman"/>
+        </w:rPr>
+      </w:pPr>
+      <w:bookmarkStart w:id="2" w:name="the-problem"/>
+      <w:r>
+        <w:rPr>
+          <w:rFonts w:ascii="Times New Roman" w:hAnsi="Times New Roman" w:cs="Times New Roman"/>
+        </w:rPr>
         <w:t>The problem</w:t>
       </w:r>
     </w:p>
@@ -34,279 +87,65 @@
       <w:pPr>
         <w:pStyle w:val="FirstParagraph"/>
         <w:jc w:val="both"/>
-      </w:pPr>
-      <w:r>
+        <w:rPr>
+          <w:rFonts w:ascii="Times New Roman" w:hAnsi="Times New Roman" w:cs="Times New Roman"/>
+        </w:rPr>
+      </w:pPr>
+      <w:r>
+        <w:rPr>
+          <w:rFonts w:ascii="Times New Roman" w:hAnsi="Times New Roman" w:cs="Times New Roman"/>
+        </w:rPr>
         <w:t xml:space="preserve">Public health data — life expectancy, child mortality, maternal health — is published by organizations like the WHO, but it’s locked inside raw API responses and spreadsheets. A student, researcher, or health worker who wants to answer a simple question like </w:t>
       </w:r>
       <w:r>
-        <w:t xml:space="preserve">“how has under-5 mortality changed in Kenya over the last five years?” </w:t>
-      </w:r>
-      <w:r>
-        <w:t>has to know how to query an API, parse JSON, and build their own chart before they can answer it.</w:t>
-      </w:r>
-    </w:p>
-    <w:p>
-      <w:pPr>
-        <w:pStyle w:val="Heading2"/>
-        <w:jc w:val="both"/>
-      </w:pPr>
-      <w:bookmarkStart w:id="2" w:name="the-solution"/>
-      <w:bookmarkEnd w:id="1"/>
-      <w:r>
-        <w:t>The solution</w:t>
-      </w:r>
-    </w:p>
-    <w:p>
-      <w:pPr>
-        <w:pStyle w:val="FirstParagraph"/>
-        <w:jc w:val="both"/>
-      </w:pPr>
-      <w:r>
-        <w:rPr>
+        <w:rPr>
+          <w:rFonts w:ascii="Times New Roman" w:hAnsi="Times New Roman" w:cs="Times New Roman"/>
+          <w:i/>
+          <w:iCs/>
+        </w:rPr>
+        <w:t>“how has under-5 mortality changed in Kenya over the last five years?”</w:t>
+      </w:r>
+      <w:r>
+        <w:rPr>
+          <w:rFonts w:ascii="Times New Roman" w:hAnsi="Times New Roman" w:cs="Times New Roman"/>
+        </w:rPr>
+        <w:t xml:space="preserve"> has to know how to query an API, parse JSON, and build their own chart before they can answer it. That’s time lost to tooling instead of analysis — the productivity problem we’re solving is </w:t>
+      </w:r>
+      <w:r>
+        <w:rPr>
+          <w:rFonts w:ascii="Times New Roman" w:hAnsi="Times New Roman" w:cs="Times New Roman"/>
           <w:b/>
           <w:bCs/>
         </w:rPr>
-        <w:t>Global Health Observatory</w:t>
-      </w:r>
-      <w:r>
-        <w:t xml:space="preserve"> is a dashboard that turns that question into three clicks: pick a country, pick an indicator, see the trend. No API knowledge required, no spreadsheets, no SQL.</w:t>
-      </w:r>
-    </w:p>
-    <w:p>
-      <w:pPr>
-        <w:pStyle w:val="BodyText"/>
-        <w:jc w:val="both"/>
-      </w:pPr>
-      <w:r>
-        <w:t>It started as a Phase 1 project that pulled live data from the WHO Global Health Observatory API. In Phase 2 we rebuilt it into a real full-stack application: a Flask + PostgreSQL backend that owns its own data, and an admin workflow so the dataset can be curated and grown over time — not just mirrored from a third party. As of this build, the app runs entirely on our own data. No external API calls happen at runtime.</w:t>
-      </w:r>
-    </w:p>
-    <w:p>
-      <w:pPr>
-        <w:pStyle w:val="Heading2"/>
-        <w:jc w:val="both"/>
-      </w:pPr>
-      <w:bookmarkStart w:id="3" w:name="what-it-does"/>
+        <w:t>research friction</w:t>
+      </w:r>
+      <w:r>
+        <w:rPr>
+          <w:rFonts w:ascii="Times New Roman" w:hAnsi="Times New Roman" w:cs="Times New Roman"/>
+        </w:rPr>
+        <w:t>: minutes-to-hours of manual data wrangling collapsed into a few clicks.</w:t>
+      </w:r>
+    </w:p>
+    <w:p>
+      <w:pPr>
+        <w:pStyle w:val="Heading3"/>
+        <w:jc w:val="both"/>
+        <w:rPr>
+          <w:rFonts w:ascii="Times New Roman" w:hAnsi="Times New Roman" w:cs="Times New Roman"/>
+        </w:rPr>
+      </w:pPr>
+      <w:bookmarkStart w:id="3" w:name="target-users-and-their-frustrations"/>
       <w:bookmarkEnd w:id="2"/>
       <w:r>
-        <w:t>What it does</w:t>
-      </w:r>
-    </w:p>
-    <w:p>
-      <w:pPr>
-        <w:pStyle w:val="Compact"/>
-        <w:numPr>
-          <w:ilvl w:val="0"/>
-          <w:numId w:val="2"/>
-        </w:numPr>
-        <w:jc w:val="both"/>
-      </w:pPr>
-      <w:r>
-        <w:rPr>
-          <w:b/>
-          <w:bCs/>
-        </w:rPr>
-        <w:t>Dashboard</w:t>
-      </w:r>
-      <w:r>
-        <w:t xml:space="preserve"> — pick a country, see a live grid of stat cards (life expectancy, mortality rates, and more) for the most recent year on record.</w:t>
-      </w:r>
-    </w:p>
-    <w:p>
-      <w:pPr>
-        <w:pStyle w:val="Compact"/>
-        <w:numPr>
-          <w:ilvl w:val="0"/>
-          <w:numId w:val="2"/>
-        </w:numPr>
-        <w:jc w:val="both"/>
-      </w:pPr>
-      <w:r>
-        <w:rPr>
-          <w:b/>
-          <w:bCs/>
-        </w:rPr>
-        <w:t>Trends</w:t>
-      </w:r>
-      <w:r>
-        <w:t xml:space="preserve"> — pick a country and an indicator, see how it’s changed over time on a line chart, with an auto-generated insight sentence (“Life Expectancy at Birth in Kenya increased from 65.0 (2016) to 66.7 (2021)”).</w:t>
-      </w:r>
-    </w:p>
-    <w:p>
-      <w:pPr>
-        <w:pStyle w:val="Compact"/>
-        <w:numPr>
-          <w:ilvl w:val="0"/>
-          <w:numId w:val="2"/>
-        </w:numPr>
-        <w:jc w:val="both"/>
-      </w:pPr>
-      <w:r>
-        <w:rPr>
-          <w:b/>
-          <w:bCs/>
-        </w:rPr>
-        <w:t>Compare</w:t>
-      </w:r>
-      <w:r>
-        <w:t xml:space="preserve"> — put 2–4 countries side by side on the same indicator.</w:t>
-      </w:r>
-    </w:p>
-    <w:p>
-      <w:pPr>
-        <w:pStyle w:val="Compact"/>
-        <w:numPr>
-          <w:ilvl w:val="0"/>
-          <w:numId w:val="2"/>
-        </w:numPr>
-        <w:jc w:val="both"/>
-      </w:pPr>
-      <w:r>
-        <w:rPr>
-          <w:b/>
-          <w:bCs/>
-        </w:rPr>
-        <w:t>Favorites</w:t>
-      </w:r>
-      <w:r>
-        <w:t xml:space="preserve"> — bookmark a country with a note, and jump straight back into its Trends view later.</w:t>
-      </w:r>
-    </w:p>
-    <w:p>
-      <w:pPr>
-        <w:pStyle w:val="Compact"/>
-        <w:numPr>
-          <w:ilvl w:val="0"/>
-          <w:numId w:val="2"/>
-        </w:numPr>
-        <w:jc w:val="both"/>
-      </w:pPr>
-      <w:r>
-        <w:rPr>
-          <w:b/>
-          <w:bCs/>
-        </w:rPr>
-        <w:t>Admin</w:t>
-      </w:r>
-      <w:r>
-        <w:t xml:space="preserve"> — a gated section where an administrator curates the dataset the whole app runs on: add/remove countries, define which indicators are tracked, and enter the underlying data points; a read-only view of registered users rounds it out.</w:t>
-      </w:r>
-    </w:p>
-    <w:p>
-      <w:pPr>
-        <w:pStyle w:val="Heading2"/>
-        <w:jc w:val="both"/>
-      </w:pPr>
-      <w:bookmarkStart w:id="4" w:name="why-its-more-than-a-who-api-wrapper"/>
-      <w:bookmarkEnd w:id="3"/>
-      <w:r>
-        <w:lastRenderedPageBreak/>
-        <w:t>Why it’s more than “a WHO API wrapper”</w:t>
-      </w:r>
-    </w:p>
-    <w:p>
-      <w:pPr>
-        <w:pStyle w:val="FirstParagraph"/>
-        <w:jc w:val="both"/>
-      </w:pPr>
-      <w:r>
-        <w:t>Most Phase 1 dashboards in this space stop at fetching and displaying a public API. We went further:</w:t>
-      </w:r>
-    </w:p>
-    <w:p>
-      <w:pPr>
-        <w:pStyle w:val="Compact"/>
-        <w:numPr>
-          <w:ilvl w:val="0"/>
-          <w:numId w:val="3"/>
-        </w:numPr>
-        <w:jc w:val="both"/>
-      </w:pPr>
-      <w:r>
-        <w:rPr>
-          <w:b/>
-          <w:bCs/>
-        </w:rPr>
-        <w:t>Our own database, our own schema.</w:t>
-      </w:r>
-      <w:r>
-        <w:t xml:space="preserve"> Countries, indicators, and their data points live in PostgreSQL with proper relationships and migrations — not fetched fresh on every page load.</w:t>
-      </w:r>
-    </w:p>
-    <w:p>
-      <w:pPr>
-        <w:pStyle w:val="Compact"/>
-        <w:numPr>
-          <w:ilvl w:val="0"/>
-          <w:numId w:val="3"/>
-        </w:numPr>
-        <w:jc w:val="both"/>
-      </w:pPr>
-      <w:r>
-        <w:rPr>
-          <w:b/>
-          <w:bCs/>
-        </w:rPr>
-        <w:t>Admin-curated, not API-curated.</w:t>
-      </w:r>
-      <w:r>
-        <w:t xml:space="preserve"> What the app shows is a deliberate editorial choice made through an admin UI, not whatever a third party’s catalog happens to contain.</w:t>
-      </w:r>
-    </w:p>
-    <w:p>
-      <w:pPr>
-        <w:pStyle w:val="Compact"/>
-        <w:numPr>
-          <w:ilvl w:val="0"/>
-          <w:numId w:val="3"/>
-        </w:numPr>
-        <w:jc w:val="both"/>
-      </w:pPr>
-      <w:r>
-        <w:rPr>
-          <w:b/>
-          <w:bCs/>
-        </w:rPr>
-        <w:t>Resilient by design.</w:t>
-      </w:r>
-      <w:r>
-        <w:t xml:space="preserve"> Because there’s no runtime dependency on an external API, the app doesn’t go down, rate-limit, or slow down when someone else’s service does.</w:t>
-      </w:r>
-    </w:p>
-    <w:p>
-      <w:pPr>
-        <w:pStyle w:val="Compact"/>
-        <w:numPr>
-          <w:ilvl w:val="0"/>
-          <w:numId w:val="3"/>
-        </w:numPr>
-        <w:jc w:val="both"/>
-      </w:pPr>
-      <w:r>
-        <w:rPr>
-          <w:b/>
-          <w:bCs/>
-        </w:rPr>
-        <w:t>Built for what’s next.</w:t>
-      </w:r>
-      <w:r>
-        <w:t xml:space="preserve"> The schema and auth model were designed so Phase 3 (full user accounts, per-user favorites, richer roles) is an extension of what exists today, not a rewrite.</w:t>
-      </w:r>
-    </w:p>
-    <w:p>
-      <w:pPr>
-        <w:pStyle w:val="Heading2"/>
-        <w:jc w:val="both"/>
-      </w:pPr>
-      <w:bookmarkStart w:id="5" w:name="tech-stack"/>
-      <w:bookmarkEnd w:id="4"/>
-      <w:r>
-        <w:t>Tech stack</w:t>
+        <w:rPr>
+          <w:rFonts w:ascii="Times New Roman" w:hAnsi="Times New Roman" w:cs="Times New Roman"/>
+        </w:rPr>
+        <w:t>Target users and their frustrations</w:t>
       </w:r>
     </w:p>
     <w:tbl>
       <w:tblPr>
-        <w:tblStyle w:val="GridTable1Light-Accent6"/>
+        <w:tblStyle w:val="GridTable1Light-Accent3"/>
         <w:tblW w:w="5000" w:type="pct"/>
         <w:tblLayout w:type="fixed"/>
         <w:tblLook w:val="0020" w:firstRow="1" w:lastRow="0" w:firstColumn="0" w:lastColumn="0" w:noHBand="0" w:noVBand="0"/>
@@ -327,9 +166,15 @@
             <w:pPr>
               <w:pStyle w:val="Compact"/>
               <w:jc w:val="both"/>
-            </w:pPr>
-            <w:r>
-              <w:t>Layer</w:t>
+              <w:rPr>
+                <w:rFonts w:ascii="Times New Roman" w:hAnsi="Times New Roman" w:cs="Times New Roman"/>
+              </w:rPr>
+            </w:pPr>
+            <w:r>
+              <w:rPr>
+                <w:rFonts w:ascii="Times New Roman" w:hAnsi="Times New Roman" w:cs="Times New Roman"/>
+              </w:rPr>
+              <w:t>User</w:t>
             </w:r>
           </w:p>
         </w:tc>
@@ -341,9 +186,15 @@
             <w:pPr>
               <w:pStyle w:val="Compact"/>
               <w:jc w:val="both"/>
-            </w:pPr>
-            <w:r>
-              <w:t>Choice</w:t>
+              <w:rPr>
+                <w:rFonts w:ascii="Times New Roman" w:hAnsi="Times New Roman" w:cs="Times New Roman"/>
+              </w:rPr>
+            </w:pPr>
+            <w:r>
+              <w:rPr>
+                <w:rFonts w:ascii="Times New Roman" w:hAnsi="Times New Roman" w:cs="Times New Roman"/>
+              </w:rPr>
+              <w:t>Daily frustration</w:t>
             </w:r>
           </w:p>
         </w:tc>
@@ -357,9 +208,15 @@
             <w:pPr>
               <w:pStyle w:val="Compact"/>
               <w:jc w:val="both"/>
-            </w:pPr>
-            <w:r>
-              <w:t>Frontend</w:t>
+              <w:rPr>
+                <w:rFonts w:ascii="Times New Roman" w:hAnsi="Times New Roman" w:cs="Times New Roman"/>
+              </w:rPr>
+            </w:pPr>
+            <w:r>
+              <w:rPr>
+                <w:rFonts w:ascii="Times New Roman" w:hAnsi="Times New Roman" w:cs="Times New Roman"/>
+              </w:rPr>
+              <w:t>Public health students</w:t>
             </w:r>
           </w:p>
         </w:tc>
@@ -371,9 +228,15 @@
             <w:pPr>
               <w:pStyle w:val="Compact"/>
               <w:jc w:val="both"/>
-            </w:pPr>
-            <w:r>
-              <w:t>React 19, React Router, Recharts, Axios</w:t>
+              <w:rPr>
+                <w:rFonts w:ascii="Times New Roman" w:hAnsi="Times New Roman" w:cs="Times New Roman"/>
+              </w:rPr>
+            </w:pPr>
+            <w:r>
+              <w:rPr>
+                <w:rFonts w:ascii="Times New Roman" w:hAnsi="Times New Roman" w:cs="Times New Roman"/>
+              </w:rPr>
+              <w:t>Re-collecting the same WHO indicators by hand for every assignment; no single place to compare countries</w:t>
             </w:r>
           </w:p>
         </w:tc>
@@ -387,9 +250,15 @@
             <w:pPr>
               <w:pStyle w:val="Compact"/>
               <w:jc w:val="both"/>
-            </w:pPr>
-            <w:r>
-              <w:t>Backend</w:t>
+              <w:rPr>
+                <w:rFonts w:ascii="Times New Roman" w:hAnsi="Times New Roman" w:cs="Times New Roman"/>
+              </w:rPr>
+            </w:pPr>
+            <w:r>
+              <w:rPr>
+                <w:rFonts w:ascii="Times New Roman" w:hAnsi="Times New Roman" w:cs="Times New Roman"/>
+              </w:rPr>
+              <w:t>NGO / policy researchers</w:t>
             </w:r>
           </w:p>
         </w:tc>
@@ -401,9 +270,15 @@
             <w:pPr>
               <w:pStyle w:val="Compact"/>
               <w:jc w:val="both"/>
-            </w:pPr>
-            <w:r>
-              <w:t>Flask, SQLAlchemy, Flask-Migrate, Flask-CORS</w:t>
+              <w:rPr>
+                <w:rFonts w:ascii="Times New Roman" w:hAnsi="Times New Roman" w:cs="Times New Roman"/>
+              </w:rPr>
+            </w:pPr>
+            <w:r>
+              <w:rPr>
+                <w:rFonts w:ascii="Times New Roman" w:hAnsi="Times New Roman" w:cs="Times New Roman"/>
+              </w:rPr>
+              <w:t>Need a quick, citable trend view without standing up their own data pipeline</w:t>
             </w:r>
           </w:p>
         </w:tc>
@@ -417,9 +292,15 @@
             <w:pPr>
               <w:pStyle w:val="Compact"/>
               <w:jc w:val="both"/>
-            </w:pPr>
-            <w:r>
-              <w:t>Database</w:t>
+              <w:rPr>
+                <w:rFonts w:ascii="Times New Roman" w:hAnsi="Times New Roman" w:cs="Times New Roman"/>
+              </w:rPr>
+            </w:pPr>
+            <w:r>
+              <w:rPr>
+                <w:rFonts w:ascii="Times New Roman" w:hAnsi="Times New Roman" w:cs="Times New Roman"/>
+              </w:rPr>
+              <w:t>Journalists / advocates</w:t>
             </w:r>
           </w:p>
         </w:tc>
@@ -431,9 +312,15 @@
             <w:pPr>
               <w:pStyle w:val="Compact"/>
               <w:jc w:val="both"/>
-            </w:pPr>
-            <w:r>
-              <w:t>PostgreSQL</w:t>
+              <w:rPr>
+                <w:rFonts w:ascii="Times New Roman" w:hAnsi="Times New Roman" w:cs="Times New Roman"/>
+              </w:rPr>
+            </w:pPr>
+            <w:r>
+              <w:rPr>
+                <w:rFonts w:ascii="Times New Roman" w:hAnsi="Times New Roman" w:cs="Times New Roman"/>
+              </w:rPr>
+              <w:t>Want a defensible number (“maternal mortality in Kenya rose X%”) fast, without misreading raw API JSON</w:t>
             </w:r>
           </w:p>
         </w:tc>
@@ -447,9 +334,15 @@
             <w:pPr>
               <w:pStyle w:val="Compact"/>
               <w:jc w:val="both"/>
-            </w:pPr>
-            <w:r>
-              <w:t>Auth</w:t>
+              <w:rPr>
+                <w:rFonts w:ascii="Times New Roman" w:hAnsi="Times New Roman" w:cs="Times New Roman"/>
+              </w:rPr>
+            </w:pPr>
+            <w:r>
+              <w:rPr>
+                <w:rFonts w:ascii="Times New Roman" w:hAnsi="Times New Roman" w:cs="Times New Roman"/>
+              </w:rPr>
+              <w:t>Our own team (Phase 3)</w:t>
             </w:r>
           </w:p>
         </w:tc>
@@ -461,27 +354,15 @@
             <w:pPr>
               <w:pStyle w:val="Compact"/>
               <w:jc w:val="both"/>
-            </w:pPr>
-            <w:r>
-              <w:t>Lightweight signed-token admin gate (</w:t>
-            </w:r>
-            <w:r>
-              <w:rPr>
-                <w:rStyle w:val="VerbatimChar"/>
-              </w:rPr>
-              <w:t>itsdangerous</w:t>
-            </w:r>
-            <w:r>
-              <w:t xml:space="preserve"> + </w:t>
-            </w:r>
-            <w:r>
-              <w:rPr>
-                <w:rStyle w:val="VerbatimChar"/>
-              </w:rPr>
-              <w:t>werkzeug</w:t>
-            </w:r>
-            <w:r>
-              <w:t xml:space="preserve"> password hashing)</w:t>
+              <w:rPr>
+                <w:rFonts w:ascii="Times New Roman" w:hAnsi="Times New Roman" w:cs="Times New Roman"/>
+              </w:rPr>
+            </w:pPr>
+            <w:r>
+              <w:rPr>
+                <w:rFonts w:ascii="Times New Roman" w:hAnsi="Times New Roman" w:cs="Times New Roman"/>
+              </w:rPr>
+              <w:t>Need a dataset we control — curated, versioned, not at the mercy of a third-party API’s uptime or schema changes</w:t>
             </w:r>
           </w:p>
         </w:tc>
@@ -489,74 +370,1047 @@
     </w:tbl>
     <w:p>
       <w:pPr>
+        <w:pStyle w:val="Heading3"/>
+        <w:jc w:val="both"/>
+        <w:rPr>
+          <w:rFonts w:ascii="Times New Roman" w:hAnsi="Times New Roman" w:cs="Times New Roman"/>
+        </w:rPr>
+      </w:pPr>
+      <w:bookmarkStart w:id="4" w:name="why-our-solution-adds-value"/>
+      <w:bookmarkEnd w:id="3"/>
+      <w:r>
+        <w:rPr>
+          <w:rFonts w:ascii="Times New Roman" w:hAnsi="Times New Roman" w:cs="Times New Roman"/>
+        </w:rPr>
+        <w:t>Why our solution adds value</w:t>
+      </w:r>
+    </w:p>
+    <w:p>
+      <w:pPr>
+        <w:pStyle w:val="FirstParagraph"/>
+        <w:jc w:val="both"/>
+        <w:rPr>
+          <w:rFonts w:ascii="Times New Roman" w:hAnsi="Times New Roman" w:cs="Times New Roman"/>
+        </w:rPr>
+      </w:pPr>
+      <w:r>
+        <w:rPr>
+          <w:rFonts w:ascii="Times New Roman" w:hAnsi="Times New Roman" w:cs="Times New Roman"/>
+          <w:b/>
+          <w:bCs/>
+        </w:rPr>
+        <w:t>Global Health Observatory</w:t>
+      </w:r>
+      <w:r>
+        <w:rPr>
+          <w:rFonts w:ascii="Times New Roman" w:hAnsi="Times New Roman" w:cs="Times New Roman"/>
+        </w:rPr>
+        <w:t xml:space="preserve"> turns “how has X changed in Y?” into three clicks: pick a country, pick an indicator, see the trend. In Phase 1 this ran on live calls to the public WHO GHO API. In Phase 2 we are replacing that dependency with our </w:t>
+      </w:r>
+      <w:r>
+        <w:rPr>
+          <w:rFonts w:ascii="Times New Roman" w:hAnsi="Times New Roman" w:cs="Times New Roman"/>
+          <w:b/>
+          <w:bCs/>
+        </w:rPr>
+        <w:t>own Flask + PostgreSQL backend</w:t>
+      </w:r>
+      <w:r>
+        <w:rPr>
+          <w:rFonts w:ascii="Times New Roman" w:hAnsi="Times New Roman" w:cs="Times New Roman"/>
+        </w:rPr>
+        <w:t xml:space="preserve"> so the app:</w:t>
+      </w:r>
+    </w:p>
+    <w:p>
+      <w:pPr>
+        <w:pStyle w:val="Compact"/>
+        <w:numPr>
+          <w:ilvl w:val="0"/>
+          <w:numId w:val="2"/>
+        </w:numPr>
+        <w:jc w:val="both"/>
+        <w:rPr>
+          <w:rFonts w:ascii="Times New Roman" w:hAnsi="Times New Roman" w:cs="Times New Roman"/>
+        </w:rPr>
+      </w:pPr>
+      <w:r>
+        <w:rPr>
+          <w:rFonts w:ascii="Times New Roman" w:hAnsi="Times New Roman" w:cs="Times New Roman"/>
+        </w:rPr>
+        <w:t>Never breaks or slows down because a third party’s API rate-limits or changes shape.</w:t>
+      </w:r>
+    </w:p>
+    <w:p>
+      <w:pPr>
+        <w:pStyle w:val="Compact"/>
+        <w:numPr>
+          <w:ilvl w:val="0"/>
+          <w:numId w:val="2"/>
+        </w:numPr>
+        <w:jc w:val="both"/>
+        <w:rPr>
+          <w:rFonts w:ascii="Times New Roman" w:hAnsi="Times New Roman" w:cs="Times New Roman"/>
+        </w:rPr>
+      </w:pPr>
+      <w:r>
+        <w:rPr>
+          <w:rFonts w:ascii="Times New Roman" w:hAnsi="Times New Roman" w:cs="Times New Roman"/>
+        </w:rPr>
+        <w:t>Owns an editorial, admin-curated dataset instead of mirroring whatever the WHO catalog happens to contain that day.</w:t>
+      </w:r>
+    </w:p>
+    <w:p>
+      <w:pPr>
+        <w:pStyle w:val="Compact"/>
+        <w:numPr>
+          <w:ilvl w:val="0"/>
+          <w:numId w:val="2"/>
+        </w:numPr>
+        <w:jc w:val="both"/>
+        <w:rPr>
+          <w:rFonts w:ascii="Times New Roman" w:hAnsi="Times New Roman" w:cs="Times New Roman"/>
+        </w:rPr>
+      </w:pPr>
+      <w:r>
+        <w:rPr>
+          <w:rFonts w:ascii="Times New Roman" w:hAnsi="Times New Roman" w:cs="Times New Roman"/>
+        </w:rPr>
+        <w:lastRenderedPageBreak/>
+        <w:t>Has a real data model (with relationships and migrations) that Phase 3 can extend — per-user accounts, richer roles — instead of rewriting.</w:t>
+      </w:r>
+    </w:p>
+    <w:p>
+      <w:pPr>
+        <w:pStyle w:val="FirstParagraph"/>
+        <w:jc w:val="both"/>
+        <w:rPr>
+          <w:rFonts w:ascii="Times New Roman" w:hAnsi="Times New Roman" w:cs="Times New Roman"/>
+        </w:rPr>
+      </w:pPr>
+      <w:r>
+        <w:rPr>
+          <w:rFonts w:ascii="Times New Roman" w:hAnsi="Times New Roman" w:cs="Times New Roman"/>
+        </w:rPr>
+        <w:t>No external API or AI service is called at runtime after this migration; the WHO API is used once, offline, as the source for our seed data.</w:t>
+      </w:r>
+    </w:p>
+    <w:p>
+      <w:pPr>
+        <w:pStyle w:val="Heading3"/>
+        <w:jc w:val="both"/>
+        <w:rPr>
+          <w:rFonts w:ascii="Times New Roman" w:hAnsi="Times New Roman" w:cs="Times New Roman"/>
+        </w:rPr>
+      </w:pPr>
+      <w:bookmarkStart w:id="5" w:name="primary-goals"/>
+      <w:bookmarkEnd w:id="4"/>
+      <w:r>
+        <w:rPr>
+          <w:rFonts w:ascii="Times New Roman" w:hAnsi="Times New Roman" w:cs="Times New Roman"/>
+        </w:rPr>
+        <w:t>Primary goals</w:t>
+      </w:r>
+    </w:p>
+    <w:p>
+      <w:pPr>
+        <w:pStyle w:val="Compact"/>
+        <w:numPr>
+          <w:ilvl w:val="0"/>
+          <w:numId w:val="3"/>
+        </w:numPr>
+        <w:jc w:val="both"/>
+        <w:rPr>
+          <w:rFonts w:ascii="Times New Roman" w:hAnsi="Times New Roman" w:cs="Times New Roman"/>
+        </w:rPr>
+      </w:pPr>
+      <w:r>
+        <w:rPr>
+          <w:rFonts w:ascii="Times New Roman" w:hAnsi="Times New Roman" w:cs="Times New Roman"/>
+        </w:rPr>
+        <w:t>Replace every Phase 1 call to the public WHO API with our own Flask REST API backed by PostgreSQL.</w:t>
+      </w:r>
+    </w:p>
+    <w:p>
+      <w:pPr>
+        <w:pStyle w:val="Compact"/>
+        <w:numPr>
+          <w:ilvl w:val="0"/>
+          <w:numId w:val="3"/>
+        </w:numPr>
+        <w:jc w:val="both"/>
+        <w:rPr>
+          <w:rFonts w:ascii="Times New Roman" w:hAnsi="Times New Roman" w:cs="Times New Roman"/>
+        </w:rPr>
+      </w:pPr>
+      <w:r>
+        <w:rPr>
+          <w:rFonts w:ascii="Times New Roman" w:hAnsi="Times New Roman" w:cs="Times New Roman"/>
+        </w:rPr>
+        <w:t>Ship full CRUD on at least one custom resource (Favorites) and model at least two related resources (Country ↔ DataPoint ↔ Indicator).</w:t>
+      </w:r>
+    </w:p>
+    <w:p>
+      <w:pPr>
+        <w:pStyle w:val="Compact"/>
+        <w:numPr>
+          <w:ilvl w:val="0"/>
+          <w:numId w:val="3"/>
+        </w:numPr>
+        <w:jc w:val="both"/>
+        <w:rPr>
+          <w:rFonts w:ascii="Times New Roman" w:hAnsi="Times New Roman" w:cs="Times New Roman"/>
+        </w:rPr>
+      </w:pPr>
+      <w:r>
+        <w:rPr>
+          <w:rFonts w:ascii="Times New Roman" w:hAnsi="Times New Roman" w:cs="Times New Roman"/>
+        </w:rPr>
+        <w:t>Keep the existing Dashboard / Trends / Compare user experience working unchanged from the user’s point of view — the migration should be invisible to them.</w:t>
+      </w:r>
+    </w:p>
+    <w:p>
+      <w:pPr>
+        <w:pStyle w:val="Heading3"/>
+        <w:jc w:val="both"/>
+        <w:rPr>
+          <w:rFonts w:ascii="Times New Roman" w:hAnsi="Times New Roman" w:cs="Times New Roman"/>
+        </w:rPr>
+      </w:pPr>
+      <w:bookmarkStart w:id="6" w:name="user-stories"/>
+      <w:bookmarkEnd w:id="5"/>
+      <w:r>
+        <w:rPr>
+          <w:rFonts w:ascii="Times New Roman" w:hAnsi="Times New Roman" w:cs="Times New Roman"/>
+        </w:rPr>
+        <w:t>User stories</w:t>
+      </w:r>
+    </w:p>
+    <w:p>
+      <w:pPr>
+        <w:pStyle w:val="Compact"/>
+        <w:numPr>
+          <w:ilvl w:val="0"/>
+          <w:numId w:val="4"/>
+        </w:numPr>
+        <w:jc w:val="both"/>
+        <w:rPr>
+          <w:rFonts w:ascii="Times New Roman" w:hAnsi="Times New Roman" w:cs="Times New Roman"/>
+        </w:rPr>
+      </w:pPr>
+      <w:r>
+        <w:rPr>
+          <w:rFonts w:ascii="Times New Roman" w:hAnsi="Times New Roman" w:cs="Times New Roman"/>
+        </w:rPr>
+        <w:t xml:space="preserve">As a </w:t>
+      </w:r>
+      <w:r>
+        <w:rPr>
+          <w:rFonts w:ascii="Times New Roman" w:hAnsi="Times New Roman" w:cs="Times New Roman"/>
+          <w:b/>
+          <w:bCs/>
+        </w:rPr>
+        <w:t>student</w:t>
+      </w:r>
+      <w:r>
+        <w:rPr>
+          <w:rFonts w:ascii="Times New Roman" w:hAnsi="Times New Roman" w:cs="Times New Roman"/>
+        </w:rPr>
+        <w:t>, I want to pick a country and instantly see its latest key health stats, so I don’t have to look them up one indicator at a time.</w:t>
+      </w:r>
+    </w:p>
+    <w:p>
+      <w:pPr>
+        <w:pStyle w:val="Compact"/>
+        <w:numPr>
+          <w:ilvl w:val="0"/>
+          <w:numId w:val="4"/>
+        </w:numPr>
+        <w:jc w:val="both"/>
+        <w:rPr>
+          <w:rFonts w:ascii="Times New Roman" w:hAnsi="Times New Roman" w:cs="Times New Roman"/>
+        </w:rPr>
+      </w:pPr>
+      <w:r>
+        <w:rPr>
+          <w:rFonts w:ascii="Times New Roman" w:hAnsi="Times New Roman" w:cs="Times New Roman"/>
+        </w:rPr>
+        <w:t xml:space="preserve">As a </w:t>
+      </w:r>
+      <w:r>
+        <w:rPr>
+          <w:rFonts w:ascii="Times New Roman" w:hAnsi="Times New Roman" w:cs="Times New Roman"/>
+          <w:b/>
+          <w:bCs/>
+        </w:rPr>
+        <w:t>researcher</w:t>
+      </w:r>
+      <w:r>
+        <w:rPr>
+          <w:rFonts w:ascii="Times New Roman" w:hAnsi="Times New Roman" w:cs="Times New Roman"/>
+        </w:rPr>
+        <w:t>, I want to view an indicator’s trend over time with an auto-generated summary sentence, so I can cite a number without eyeballing a chart.</w:t>
+      </w:r>
+    </w:p>
+    <w:p>
+      <w:pPr>
+        <w:pStyle w:val="Compact"/>
+        <w:numPr>
+          <w:ilvl w:val="0"/>
+          <w:numId w:val="4"/>
+        </w:numPr>
+        <w:jc w:val="both"/>
+        <w:rPr>
+          <w:rFonts w:ascii="Times New Roman" w:hAnsi="Times New Roman" w:cs="Times New Roman"/>
+        </w:rPr>
+      </w:pPr>
+      <w:r>
+        <w:rPr>
+          <w:rFonts w:ascii="Times New Roman" w:hAnsi="Times New Roman" w:cs="Times New Roman"/>
+        </w:rPr>
+        <w:t xml:space="preserve">As a </w:t>
+      </w:r>
+      <w:r>
+        <w:rPr>
+          <w:rFonts w:ascii="Times New Roman" w:hAnsi="Times New Roman" w:cs="Times New Roman"/>
+          <w:b/>
+          <w:bCs/>
+        </w:rPr>
+        <w:t>frequent visitor</w:t>
+      </w:r>
+      <w:r>
+        <w:rPr>
+          <w:rFonts w:ascii="Times New Roman" w:hAnsi="Times New Roman" w:cs="Times New Roman"/>
+        </w:rPr>
+        <w:t>, I want to bookmark a country with a personal note, so I can jump straight back into my area of focus later.</w:t>
+      </w:r>
+    </w:p>
+    <w:p>
+      <w:pPr>
+        <w:pStyle w:val="Compact"/>
+        <w:numPr>
+          <w:ilvl w:val="0"/>
+          <w:numId w:val="4"/>
+        </w:numPr>
+        <w:jc w:val="both"/>
+        <w:rPr>
+          <w:rFonts w:ascii="Times New Roman" w:hAnsi="Times New Roman" w:cs="Times New Roman"/>
+        </w:rPr>
+      </w:pPr>
+      <w:r>
+        <w:rPr>
+          <w:rFonts w:ascii="Times New Roman" w:hAnsi="Times New Roman" w:cs="Times New Roman"/>
+        </w:rPr>
+        <w:t xml:space="preserve">As an </w:t>
+      </w:r>
+      <w:r>
+        <w:rPr>
+          <w:rFonts w:ascii="Times New Roman" w:hAnsi="Times New Roman" w:cs="Times New Roman"/>
+          <w:b/>
+          <w:bCs/>
+        </w:rPr>
+        <w:t>admin</w:t>
+      </w:r>
+      <w:r>
+        <w:rPr>
+          <w:rFonts w:ascii="Times New Roman" w:hAnsi="Times New Roman" w:cs="Times New Roman"/>
+        </w:rPr>
+        <w:t>, I want to add, edit, and remove countries, indicators, and data points through a UI, so the dataset can grow without anyone touching the database directly.</w:t>
+      </w:r>
+    </w:p>
+    <w:p>
+      <w:pPr>
         <w:pStyle w:val="Heading2"/>
         <w:jc w:val="both"/>
-      </w:pPr>
-      <w:bookmarkStart w:id="6" w:name="architecture-at-a-glance"/>
-      <w:bookmarkEnd w:id="5"/>
-      <w:r>
-        <w:t>Architecture at a glance</w:t>
+        <w:rPr>
+          <w:rFonts w:ascii="Times New Roman" w:hAnsi="Times New Roman" w:cs="Times New Roman"/>
+        </w:rPr>
+      </w:pPr>
+      <w:bookmarkStart w:id="7" w:name="step-2-problem-solving-process"/>
+      <w:bookmarkEnd w:id="1"/>
+      <w:bookmarkEnd w:id="6"/>
+      <w:r>
+        <w:rPr>
+          <w:rFonts w:ascii="Times New Roman" w:hAnsi="Times New Roman" w:cs="Times New Roman"/>
+        </w:rPr>
+        <w:t>Problem Solving Process</w:t>
+      </w:r>
+    </w:p>
+    <w:p>
+      <w:pPr>
+        <w:pStyle w:val="Heading3"/>
+        <w:jc w:val="both"/>
+        <w:rPr>
+          <w:rFonts w:ascii="Times New Roman" w:hAnsi="Times New Roman" w:cs="Times New Roman"/>
+        </w:rPr>
+      </w:pPr>
+      <w:bookmarkStart w:id="8" w:name="step-by-step-build-process"/>
+      <w:r>
+        <w:rPr>
+          <w:rFonts w:ascii="Times New Roman" w:hAnsi="Times New Roman" w:cs="Times New Roman"/>
+        </w:rPr>
+        <w:t>Step-by-step build process</w:t>
+      </w:r>
+    </w:p>
+    <w:p>
+      <w:pPr>
+        <w:pStyle w:val="Compact"/>
+        <w:numPr>
+          <w:ilvl w:val="0"/>
+          <w:numId w:val="5"/>
+        </w:numPr>
+        <w:jc w:val="both"/>
+        <w:rPr>
+          <w:rFonts w:ascii="Times New Roman" w:hAnsi="Times New Roman" w:cs="Times New Roman"/>
+        </w:rPr>
+      </w:pPr>
+      <w:r>
+        <w:rPr>
+          <w:rFonts w:ascii="Times New Roman" w:hAnsi="Times New Roman" w:cs="Times New Roman"/>
+          <w:b/>
+          <w:bCs/>
+        </w:rPr>
+        <w:t>Requirements &amp; data modeling</w:t>
+      </w:r>
+      <w:r>
+        <w:rPr>
+          <w:rFonts w:ascii="Times New Roman" w:hAnsi="Times New Roman" w:cs="Times New Roman"/>
+        </w:rPr>
+        <w:t xml:space="preserve"> — map the fields our Phase 1 frontend already consumed from the WHO API onto our own schema: </w:t>
+      </w:r>
+      <w:r>
+        <w:rPr>
+          <w:rStyle w:val="VerbatimChar"/>
+          <w:rFonts w:ascii="Times New Roman" w:hAnsi="Times New Roman" w:cs="Times New Roman"/>
+        </w:rPr>
+        <w:t>Country</w:t>
+      </w:r>
+      <w:r>
+        <w:rPr>
+          <w:rFonts w:ascii="Times New Roman" w:hAnsi="Times New Roman" w:cs="Times New Roman"/>
+        </w:rPr>
+        <w:t xml:space="preserve">, </w:t>
+      </w:r>
+      <w:r>
+        <w:rPr>
+          <w:rStyle w:val="VerbatimChar"/>
+          <w:rFonts w:ascii="Times New Roman" w:hAnsi="Times New Roman" w:cs="Times New Roman"/>
+        </w:rPr>
+        <w:t>Indicator</w:t>
+      </w:r>
+      <w:r>
+        <w:rPr>
+          <w:rFonts w:ascii="Times New Roman" w:hAnsi="Times New Roman" w:cs="Times New Roman"/>
+        </w:rPr>
+        <w:t xml:space="preserve">, </w:t>
+      </w:r>
+      <w:r>
+        <w:rPr>
+          <w:rStyle w:val="VerbatimChar"/>
+          <w:rFonts w:ascii="Times New Roman" w:hAnsi="Times New Roman" w:cs="Times New Roman"/>
+        </w:rPr>
+        <w:t>DataPoint</w:t>
+      </w:r>
+      <w:r>
+        <w:rPr>
+          <w:rFonts w:ascii="Times New Roman" w:hAnsi="Times New Roman" w:cs="Times New Roman"/>
+        </w:rPr>
+        <w:t xml:space="preserve">, </w:t>
+      </w:r>
+      <w:r>
+        <w:rPr>
+          <w:rStyle w:val="VerbatimChar"/>
+          <w:rFonts w:ascii="Times New Roman" w:hAnsi="Times New Roman" w:cs="Times New Roman"/>
+        </w:rPr>
+        <w:t>Favorite</w:t>
+      </w:r>
+      <w:r>
+        <w:rPr>
+          <w:rFonts w:ascii="Times New Roman" w:hAnsi="Times New Roman" w:cs="Times New Roman"/>
+        </w:rPr>
+        <w:t xml:space="preserve">, </w:t>
+      </w:r>
+      <w:r>
+        <w:rPr>
+          <w:rStyle w:val="VerbatimChar"/>
+          <w:rFonts w:ascii="Times New Roman" w:hAnsi="Times New Roman" w:cs="Times New Roman"/>
+        </w:rPr>
+        <w:t>User</w:t>
+      </w:r>
+      <w:r>
+        <w:rPr>
+          <w:rFonts w:ascii="Times New Roman" w:hAnsi="Times New Roman" w:cs="Times New Roman"/>
+        </w:rPr>
+        <w:t>.</w:t>
+      </w:r>
+    </w:p>
+    <w:p>
+      <w:pPr>
+        <w:pStyle w:val="Compact"/>
+        <w:numPr>
+          <w:ilvl w:val="0"/>
+          <w:numId w:val="5"/>
+        </w:numPr>
+        <w:jc w:val="both"/>
+        <w:rPr>
+          <w:rFonts w:ascii="Times New Roman" w:hAnsi="Times New Roman" w:cs="Times New Roman"/>
+        </w:rPr>
+      </w:pPr>
+      <w:r>
+        <w:rPr>
+          <w:rFonts w:ascii="Times New Roman" w:hAnsi="Times New Roman" w:cs="Times New Roman"/>
+          <w:b/>
+          <w:bCs/>
+        </w:rPr>
+        <w:t>Backend scaffold</w:t>
+      </w:r>
+      <w:r>
+        <w:rPr>
+          <w:rFonts w:ascii="Times New Roman" w:hAnsi="Times New Roman" w:cs="Times New Roman"/>
+        </w:rPr>
+        <w:t xml:space="preserve"> — Flask application factory, config, extensions (</w:t>
+      </w:r>
+      <w:r>
+        <w:rPr>
+          <w:rStyle w:val="VerbatimChar"/>
+          <w:rFonts w:ascii="Times New Roman" w:hAnsi="Times New Roman" w:cs="Times New Roman"/>
+        </w:rPr>
+        <w:t>SQLAlchemy</w:t>
+      </w:r>
+      <w:r>
+        <w:rPr>
+          <w:rFonts w:ascii="Times New Roman" w:hAnsi="Times New Roman" w:cs="Times New Roman"/>
+        </w:rPr>
+        <w:t xml:space="preserve">, </w:t>
+      </w:r>
+      <w:r>
+        <w:rPr>
+          <w:rStyle w:val="VerbatimChar"/>
+          <w:rFonts w:ascii="Times New Roman" w:hAnsi="Times New Roman" w:cs="Times New Roman"/>
+        </w:rPr>
+        <w:t>Flask-Migrate</w:t>
+      </w:r>
+      <w:r>
+        <w:rPr>
+          <w:rFonts w:ascii="Times New Roman" w:hAnsi="Times New Roman" w:cs="Times New Roman"/>
+        </w:rPr>
+        <w:t xml:space="preserve">, </w:t>
+      </w:r>
+      <w:r>
+        <w:rPr>
+          <w:rStyle w:val="VerbatimChar"/>
+          <w:rFonts w:ascii="Times New Roman" w:hAnsi="Times New Roman" w:cs="Times New Roman"/>
+        </w:rPr>
+        <w:t>Flask-CORS</w:t>
+      </w:r>
+      <w:r>
+        <w:rPr>
+          <w:rFonts w:ascii="Times New Roman" w:hAnsi="Times New Roman" w:cs="Times New Roman"/>
+        </w:rPr>
+        <w:t>), PostgreSQL connection.</w:t>
+      </w:r>
+    </w:p>
+    <w:p>
+      <w:pPr>
+        <w:pStyle w:val="Compact"/>
+        <w:numPr>
+          <w:ilvl w:val="0"/>
+          <w:numId w:val="5"/>
+        </w:numPr>
+        <w:jc w:val="both"/>
+        <w:rPr>
+          <w:rFonts w:ascii="Times New Roman" w:hAnsi="Times New Roman" w:cs="Times New Roman"/>
+        </w:rPr>
+      </w:pPr>
+      <w:r>
+        <w:rPr>
+          <w:rFonts w:ascii="Times New Roman" w:hAnsi="Times New Roman" w:cs="Times New Roman"/>
+          <w:b/>
+          <w:bCs/>
+        </w:rPr>
+        <w:t>Core CRUD API</w:t>
+      </w:r>
+      <w:r>
+        <w:rPr>
+          <w:rFonts w:ascii="Times New Roman" w:hAnsi="Times New Roman" w:cs="Times New Roman"/>
+        </w:rPr>
+        <w:t xml:space="preserve"> — blueprints and routes for countries, indicators, data-points, and favorites; </w:t>
+      </w:r>
+      <w:r>
+        <w:rPr>
+          <w:rStyle w:val="VerbatimChar"/>
+          <w:rFonts w:ascii="Times New Roman" w:hAnsi="Times New Roman" w:cs="Times New Roman"/>
+        </w:rPr>
+        <w:t>marshmallow</w:t>
+      </w:r>
+      <w:r>
+        <w:rPr>
+          <w:rFonts w:ascii="Times New Roman" w:hAnsi="Times New Roman" w:cs="Times New Roman"/>
+        </w:rPr>
+        <w:t xml:space="preserve"> schemas for validation; centralized JSON error handlers for 400/404/500s.</w:t>
+      </w:r>
+    </w:p>
+    <w:p>
+      <w:pPr>
+        <w:pStyle w:val="Compact"/>
+        <w:numPr>
+          <w:ilvl w:val="0"/>
+          <w:numId w:val="5"/>
+        </w:numPr>
+        <w:jc w:val="both"/>
+        <w:rPr>
+          <w:rFonts w:ascii="Times New Roman" w:hAnsi="Times New Roman" w:cs="Times New Roman"/>
+        </w:rPr>
+      </w:pPr>
+      <w:r>
+        <w:rPr>
+          <w:rFonts w:ascii="Times New Roman" w:hAnsi="Times New Roman" w:cs="Times New Roman"/>
+          <w:b/>
+          <w:bCs/>
+        </w:rPr>
+        <w:t>Admin auth gate</w:t>
+      </w:r>
+      <w:r>
+        <w:rPr>
+          <w:rFonts w:ascii="Times New Roman" w:hAnsi="Times New Roman" w:cs="Times New Roman"/>
+        </w:rPr>
+        <w:t xml:space="preserve"> — lightweight signed-token auth (</w:t>
+      </w:r>
+      <w:r>
+        <w:rPr>
+          <w:rStyle w:val="VerbatimChar"/>
+          <w:rFonts w:ascii="Times New Roman" w:hAnsi="Times New Roman" w:cs="Times New Roman"/>
+        </w:rPr>
+        <w:t>itsdangerous</w:t>
+      </w:r>
+      <w:r>
+        <w:rPr>
+          <w:rFonts w:ascii="Times New Roman" w:hAnsi="Times New Roman" w:cs="Times New Roman"/>
+        </w:rPr>
+        <w:t xml:space="preserve"> + </w:t>
+      </w:r>
+      <w:r>
+        <w:rPr>
+          <w:rStyle w:val="VerbatimChar"/>
+          <w:rFonts w:ascii="Times New Roman" w:hAnsi="Times New Roman" w:cs="Times New Roman"/>
+        </w:rPr>
+        <w:t>werkzeug</w:t>
+      </w:r>
+      <w:r>
+        <w:rPr>
+          <w:rFonts w:ascii="Times New Roman" w:hAnsi="Times New Roman" w:cs="Times New Roman"/>
+        </w:rPr>
+        <w:t xml:space="preserve"> password hashing) so writes require an admin login; reads stay open.</w:t>
+      </w:r>
+    </w:p>
+    <w:p>
+      <w:pPr>
+        <w:pStyle w:val="Compact"/>
+        <w:numPr>
+          <w:ilvl w:val="0"/>
+          <w:numId w:val="5"/>
+        </w:numPr>
+        <w:jc w:val="both"/>
+        <w:rPr>
+          <w:rFonts w:ascii="Times New Roman" w:hAnsi="Times New Roman" w:cs="Times New Roman"/>
+        </w:rPr>
+      </w:pPr>
+      <w:r>
+        <w:rPr>
+          <w:rFonts w:ascii="Times New Roman" w:hAnsi="Times New Roman" w:cs="Times New Roman"/>
+          <w:b/>
+          <w:bCs/>
+        </w:rPr>
+        <w:t>Frontend integration</w:t>
+      </w:r>
+      <w:r>
+        <w:rPr>
+          <w:rFonts w:ascii="Times New Roman" w:hAnsi="Times New Roman" w:cs="Times New Roman"/>
+        </w:rPr>
+        <w:t xml:space="preserve"> — swap the WHO API calls in </w:t>
+      </w:r>
+      <w:r>
+        <w:rPr>
+          <w:rStyle w:val="VerbatimChar"/>
+          <w:rFonts w:ascii="Times New Roman" w:hAnsi="Times New Roman" w:cs="Times New Roman"/>
+        </w:rPr>
+        <w:t>frontend/src/services/gho.js</w:t>
+      </w:r>
+      <w:r>
+        <w:rPr>
+          <w:rFonts w:ascii="Times New Roman" w:hAnsi="Times New Roman" w:cs="Times New Roman"/>
+        </w:rPr>
+        <w:t xml:space="preserve"> for our own endpoints; keep Dashboard/Trends/Compare working against the new data shape.</w:t>
+      </w:r>
+    </w:p>
+    <w:p>
+      <w:pPr>
+        <w:pStyle w:val="Compact"/>
+        <w:numPr>
+          <w:ilvl w:val="0"/>
+          <w:numId w:val="5"/>
+        </w:numPr>
+        <w:jc w:val="both"/>
+        <w:rPr>
+          <w:rFonts w:ascii="Times New Roman" w:hAnsi="Times New Roman" w:cs="Times New Roman"/>
+        </w:rPr>
+      </w:pPr>
+      <w:r>
+        <w:rPr>
+          <w:rFonts w:ascii="Times New Roman" w:hAnsi="Times New Roman" w:cs="Times New Roman"/>
+          <w:b/>
+          <w:bCs/>
+        </w:rPr>
+        <w:t>Admin CRUD UI</w:t>
+      </w:r>
+      <w:r>
+        <w:rPr>
+          <w:rFonts w:ascii="Times New Roman" w:hAnsi="Times New Roman" w:cs="Times New Roman"/>
+        </w:rPr>
+        <w:t xml:space="preserve"> — build </w:t>
+      </w:r>
+      <w:r>
+        <w:rPr>
+          <w:rStyle w:val="VerbatimChar"/>
+          <w:rFonts w:ascii="Times New Roman" w:hAnsi="Times New Roman" w:cs="Times New Roman"/>
+        </w:rPr>
+        <w:t>AdminCountries</w:t>
+      </w:r>
+      <w:r>
+        <w:rPr>
+          <w:rFonts w:ascii="Times New Roman" w:hAnsi="Times New Roman" w:cs="Times New Roman"/>
+        </w:rPr>
+        <w:t xml:space="preserve">, </w:t>
+      </w:r>
+      <w:r>
+        <w:rPr>
+          <w:rStyle w:val="VerbatimChar"/>
+          <w:rFonts w:ascii="Times New Roman" w:hAnsi="Times New Roman" w:cs="Times New Roman"/>
+        </w:rPr>
+        <w:t>AdminIndicators</w:t>
+      </w:r>
+      <w:r>
+        <w:rPr>
+          <w:rFonts w:ascii="Times New Roman" w:hAnsi="Times New Roman" w:cs="Times New Roman"/>
+        </w:rPr>
+        <w:t xml:space="preserve">, </w:t>
+      </w:r>
+      <w:r>
+        <w:rPr>
+          <w:rStyle w:val="VerbatimChar"/>
+          <w:rFonts w:ascii="Times New Roman" w:hAnsi="Times New Roman" w:cs="Times New Roman"/>
+        </w:rPr>
+        <w:t>AdminDataPoints</w:t>
+      </w:r>
+      <w:r>
+        <w:rPr>
+          <w:rFonts w:ascii="Times New Roman" w:hAnsi="Times New Roman" w:cs="Times New Roman"/>
+        </w:rPr>
+        <w:t xml:space="preserve">, and </w:t>
+      </w:r>
+      <w:r>
+        <w:rPr>
+          <w:rStyle w:val="VerbatimChar"/>
+          <w:rFonts w:ascii="Times New Roman" w:hAnsi="Times New Roman" w:cs="Times New Roman"/>
+        </w:rPr>
+        <w:t>AdminUsers</w:t>
+      </w:r>
+      <w:r>
+        <w:rPr>
+          <w:rFonts w:ascii="Times New Roman" w:hAnsi="Times New Roman" w:cs="Times New Roman"/>
+        </w:rPr>
+        <w:t xml:space="preserve"> pages so the dataset can be curated entirely from the browser.</w:t>
+      </w:r>
+    </w:p>
+    <w:p>
+      <w:pPr>
+        <w:pStyle w:val="Compact"/>
+        <w:numPr>
+          <w:ilvl w:val="0"/>
+          <w:numId w:val="5"/>
+        </w:numPr>
+        <w:jc w:val="both"/>
+        <w:rPr>
+          <w:rFonts w:ascii="Times New Roman" w:hAnsi="Times New Roman" w:cs="Times New Roman"/>
+        </w:rPr>
+      </w:pPr>
+      <w:r>
+        <w:rPr>
+          <w:rFonts w:ascii="Times New Roman" w:hAnsi="Times New Roman" w:cs="Times New Roman"/>
+          <w:b/>
+          <w:bCs/>
+        </w:rPr>
+        <w:t>Testing, error handling &amp; deployment</w:t>
+      </w:r>
+      <w:r>
+        <w:rPr>
+          <w:rFonts w:ascii="Times New Roman" w:hAnsi="Times New Roman" w:cs="Times New Roman"/>
+        </w:rPr>
+        <w:t xml:space="preserve"> — manual + Postman testing of every endpoint, loading/error states on every page, then deploy behind Gunicorn + Nginx + PostgreSQL.</w:t>
+      </w:r>
+    </w:p>
+    <w:p>
+      <w:pPr>
+        <w:pStyle w:val="Heading3"/>
+        <w:jc w:val="both"/>
+        <w:rPr>
+          <w:rFonts w:ascii="Times New Roman" w:hAnsi="Times New Roman" w:cs="Times New Roman"/>
+        </w:rPr>
+      </w:pPr>
+      <w:bookmarkStart w:id="9" w:name="data-models-and-relationships"/>
+      <w:bookmarkEnd w:id="8"/>
+      <w:r>
+        <w:rPr>
+          <w:rFonts w:ascii="Times New Roman" w:hAnsi="Times New Roman" w:cs="Times New Roman"/>
+        </w:rPr>
+        <w:lastRenderedPageBreak/>
+        <w:t>Data models and relationships</w:t>
       </w:r>
     </w:p>
     <w:p>
       <w:pPr>
         <w:pStyle w:val="SourceCode"/>
         <w:jc w:val="both"/>
+        <w:rPr>
+          <w:rFonts w:ascii="Times New Roman" w:hAnsi="Times New Roman" w:cs="Times New Roman"/>
+        </w:rPr>
       </w:pPr>
       <w:r>
         <w:rPr>
           <w:rStyle w:val="VerbatimChar"/>
-        </w:rPr>
-        <w:t>React (Vite)  →  Axios  →  Flask REST API  →  SQLAlchemy  →  PostgreSQL</w:t>
-      </w:r>
-      <w:r>
+          <w:rFonts w:ascii="Times New Roman" w:hAnsi="Times New Roman" w:cs="Times New Roman"/>
+        </w:rPr>
+        <w:t>Country (1) ───&lt; DataPoint &gt;─── (1) Indicator</w:t>
+      </w:r>
+      <w:r>
+        <w:rPr>
+          <w:rFonts w:ascii="Times New Roman" w:hAnsi="Times New Roman" w:cs="Times New Roman"/>
+        </w:rPr>
         <w:br/>
       </w:r>
       <w:r>
         <w:rPr>
           <w:rStyle w:val="VerbatimChar"/>
-        </w:rPr>
-        <w:t xml:space="preserve">   │                            │</w:t>
-      </w:r>
-      <w:r>
+          <w:rFonts w:ascii="Times New Roman" w:hAnsi="Times New Roman" w:cs="Times New Roman"/>
+        </w:rPr>
+        <w:t xml:space="preserve">   │</w:t>
+      </w:r>
+      <w:r>
+        <w:rPr>
+          <w:rFonts w:ascii="Times New Roman" w:hAnsi="Times New Roman" w:cs="Times New Roman"/>
+        </w:rPr>
         <w:br/>
       </w:r>
       <w:r>
         <w:rPr>
           <w:rStyle w:val="VerbatimChar"/>
-        </w:rPr>
-        <w:t xml:space="preserve">   └── localStorage token ──────┘  (admin-only writes)</w:t>
-      </w:r>
-    </w:p>
-    <w:p>
-      <w:pPr>
-        <w:pStyle w:val="FirstParagraph"/>
-        <w:jc w:val="both"/>
-      </w:pPr>
-      <w:r>
-        <w:t>Every write to Countries, Indicators, or Data Points requires an admin token; every read (Dashboard, Trends, Compare, Favorites) is open, because the point of the app is to make this data easy to explore.</w:t>
-      </w:r>
-    </w:p>
-    <w:p>
-      <w:pPr>
-        <w:pStyle w:val="Heading2"/>
-        <w:jc w:val="both"/>
-      </w:pPr>
-      <w:bookmarkStart w:id="7" w:name="the-team"/>
-      <w:bookmarkEnd w:id="6"/>
-      <w:r>
-        <w:t>The team</w:t>
+          <w:rFonts w:ascii="Times New Roman" w:hAnsi="Times New Roman" w:cs="Times New Roman"/>
+        </w:rPr>
+        <w:t xml:space="preserve">   └──&lt; Favorite   (Favorite.notes, belongs to one Country)</w:t>
+      </w:r>
+      <w:r>
+        <w:rPr>
+          <w:rFonts w:ascii="Times New Roman" w:hAnsi="Times New Roman" w:cs="Times New Roman"/>
+        </w:rPr>
+        <w:br/>
+      </w:r>
+      <w:r>
+        <w:rPr>
+          <w:rFonts w:ascii="Times New Roman" w:hAnsi="Times New Roman" w:cs="Times New Roman"/>
+        </w:rPr>
+        <w:br/>
+      </w:r>
+      <w:r>
+        <w:rPr>
+          <w:rStyle w:val="VerbatimChar"/>
+          <w:rFonts w:ascii="Times New Roman" w:hAnsi="Times New Roman" w:cs="Times New Roman"/>
+        </w:rPr>
+        <w:t>User (admin-only, gates writes — not yet linked to Favorite; Phase 3 work)</w:t>
+      </w:r>
+    </w:p>
+    <w:p>
+      <w:pPr>
+        <w:pStyle w:val="Compact"/>
+        <w:numPr>
+          <w:ilvl w:val="0"/>
+          <w:numId w:val="6"/>
+        </w:numPr>
+        <w:jc w:val="both"/>
+        <w:rPr>
+          <w:rFonts w:ascii="Times New Roman" w:hAnsi="Times New Roman" w:cs="Times New Roman"/>
+        </w:rPr>
+      </w:pPr>
+      <w:r>
+        <w:rPr>
+          <w:rStyle w:val="VerbatimChar"/>
+          <w:rFonts w:ascii="Times New Roman" w:hAnsi="Times New Roman" w:cs="Times New Roman"/>
+        </w:rPr>
+        <w:t>DataPoint</w:t>
+      </w:r>
+      <w:r>
+        <w:rPr>
+          <w:rFonts w:ascii="Times New Roman" w:hAnsi="Times New Roman" w:cs="Times New Roman"/>
+        </w:rPr>
+        <w:t xml:space="preserve"> is the join between a </w:t>
+      </w:r>
+      <w:r>
+        <w:rPr>
+          <w:rStyle w:val="VerbatimChar"/>
+          <w:rFonts w:ascii="Times New Roman" w:hAnsi="Times New Roman" w:cs="Times New Roman"/>
+        </w:rPr>
+        <w:t>Country</w:t>
+      </w:r>
+      <w:r>
+        <w:rPr>
+          <w:rFonts w:ascii="Times New Roman" w:hAnsi="Times New Roman" w:cs="Times New Roman"/>
+        </w:rPr>
+        <w:t xml:space="preserve"> and an </w:t>
+      </w:r>
+      <w:r>
+        <w:rPr>
+          <w:rStyle w:val="VerbatimChar"/>
+          <w:rFonts w:ascii="Times New Roman" w:hAnsi="Times New Roman" w:cs="Times New Roman"/>
+        </w:rPr>
+        <w:t>Indicator</w:t>
+      </w:r>
+      <w:r>
+        <w:rPr>
+          <w:rFonts w:ascii="Times New Roman" w:hAnsi="Times New Roman" w:cs="Times New Roman"/>
+        </w:rPr>
+        <w:t xml:space="preserve"> for a given </w:t>
+      </w:r>
+      <w:r>
+        <w:rPr>
+          <w:rStyle w:val="VerbatimChar"/>
+          <w:rFonts w:ascii="Times New Roman" w:hAnsi="Times New Roman" w:cs="Times New Roman"/>
+        </w:rPr>
+        <w:t>year</w:t>
+      </w:r>
+      <w:r>
+        <w:rPr>
+          <w:rFonts w:ascii="Times New Roman" w:hAnsi="Times New Roman" w:cs="Times New Roman"/>
+        </w:rPr>
+        <w:t xml:space="preserve">, with a unique constraint on </w:t>
+      </w:r>
+      <w:r>
+        <w:rPr>
+          <w:rStyle w:val="VerbatimChar"/>
+          <w:rFonts w:ascii="Times New Roman" w:hAnsi="Times New Roman" w:cs="Times New Roman"/>
+        </w:rPr>
+        <w:t>(country_id, indicator_id, year)</w:t>
+      </w:r>
+      <w:r>
+        <w:rPr>
+          <w:rFonts w:ascii="Times New Roman" w:hAnsi="Times New Roman" w:cs="Times New Roman"/>
+        </w:rPr>
+        <w:t xml:space="preserve"> so the same reading can’t be entered twice.</w:t>
+      </w:r>
+    </w:p>
+    <w:p>
+      <w:pPr>
+        <w:pStyle w:val="Compact"/>
+        <w:numPr>
+          <w:ilvl w:val="0"/>
+          <w:numId w:val="6"/>
+        </w:numPr>
+        <w:jc w:val="both"/>
+        <w:rPr>
+          <w:rFonts w:ascii="Times New Roman" w:hAnsi="Times New Roman" w:cs="Times New Roman"/>
+        </w:rPr>
+      </w:pPr>
+      <w:r>
+        <w:rPr>
+          <w:rStyle w:val="VerbatimChar"/>
+          <w:rFonts w:ascii="Times New Roman" w:hAnsi="Times New Roman" w:cs="Times New Roman"/>
+        </w:rPr>
+        <w:t>Favorite</w:t>
+      </w:r>
+      <w:r>
+        <w:rPr>
+          <w:rFonts w:ascii="Times New Roman" w:hAnsi="Times New Roman" w:cs="Times New Roman"/>
+        </w:rPr>
+        <w:t xml:space="preserve"> belongs to a </w:t>
+      </w:r>
+      <w:r>
+        <w:rPr>
+          <w:rStyle w:val="VerbatimChar"/>
+          <w:rFonts w:ascii="Times New Roman" w:hAnsi="Times New Roman" w:cs="Times New Roman"/>
+        </w:rPr>
+        <w:t>Country</w:t>
+      </w:r>
+      <w:r>
+        <w:rPr>
+          <w:rFonts w:ascii="Times New Roman" w:hAnsi="Times New Roman" w:cs="Times New Roman"/>
+        </w:rPr>
+        <w:t xml:space="preserve"> and carries a free-text </w:t>
+      </w:r>
+      <w:r>
+        <w:rPr>
+          <w:rStyle w:val="VerbatimChar"/>
+          <w:rFonts w:ascii="Times New Roman" w:hAnsi="Times New Roman" w:cs="Times New Roman"/>
+        </w:rPr>
+        <w:t>notes</w:t>
+      </w:r>
+      <w:r>
+        <w:rPr>
+          <w:rFonts w:ascii="Times New Roman" w:hAnsi="Times New Roman" w:cs="Times New Roman"/>
+        </w:rPr>
+        <w:t xml:space="preserve"> field — this is our full-CRUD custom resource.</w:t>
+      </w:r>
+    </w:p>
+    <w:p>
+      <w:pPr>
+        <w:pStyle w:val="Compact"/>
+        <w:numPr>
+          <w:ilvl w:val="0"/>
+          <w:numId w:val="6"/>
+        </w:numPr>
+        <w:jc w:val="both"/>
+        <w:rPr>
+          <w:rFonts w:ascii="Times New Roman" w:hAnsi="Times New Roman" w:cs="Times New Roman"/>
+        </w:rPr>
+      </w:pPr>
+      <w:r>
+        <w:rPr>
+          <w:rStyle w:val="VerbatimChar"/>
+          <w:rFonts w:ascii="Times New Roman" w:hAnsi="Times New Roman" w:cs="Times New Roman"/>
+        </w:rPr>
+        <w:t>User</w:t>
+      </w:r>
+      <w:r>
+        <w:rPr>
+          <w:rFonts w:ascii="Times New Roman" w:hAnsi="Times New Roman" w:cs="Times New Roman"/>
+        </w:rPr>
+        <w:t xml:space="preserve"> is a flat admin-flag model for now; Phase 3 upgrades it to real per-user accounts tied to their own Favorites.</w:t>
+      </w:r>
+    </w:p>
+    <w:p>
+      <w:pPr>
+        <w:pStyle w:val="Heading3"/>
+        <w:jc w:val="both"/>
+        <w:rPr>
+          <w:rFonts w:ascii="Times New Roman" w:hAnsi="Times New Roman" w:cs="Times New Roman"/>
+        </w:rPr>
+      </w:pPr>
+      <w:bookmarkStart w:id="10" w:name="react-component-breakdown"/>
+      <w:bookmarkEnd w:id="9"/>
+      <w:r>
+        <w:rPr>
+          <w:rFonts w:ascii="Times New Roman" w:hAnsi="Times New Roman" w:cs="Times New Roman"/>
+        </w:rPr>
+        <w:t>React component breakdown</w:t>
       </w:r>
     </w:p>
     <w:tbl>
       <w:tblPr>
-        <w:tblStyle w:val="GridTable1Light-Accent6"/>
+        <w:tblStyle w:val="GridTable1Light-Accent3"/>
         <w:tblW w:w="5000" w:type="pct"/>
+        <w:tblLayout w:type="fixed"/>
         <w:tblLook w:val="0020" w:firstRow="1" w:lastRow="0" w:firstColumn="0" w:lastColumn="0" w:noHBand="0" w:noVBand="0"/>
       </w:tblPr>
       <w:tblGrid>
-        <w:gridCol w:w="3141"/>
-        <w:gridCol w:w="6435"/>
+        <w:gridCol w:w="4788"/>
+        <w:gridCol w:w="4788"/>
       </w:tblGrid>
       <w:tr>
         <w:trPr>
@@ -564,29 +1418,41 @@
         </w:trPr>
         <w:tc>
           <w:tcPr>
-            <w:tcW w:w="1640" w:type="pct"/>
-          </w:tcPr>
-          <w:p>
-            <w:pPr>
-              <w:pStyle w:val="Compact"/>
-              <w:jc w:val="both"/>
-            </w:pPr>
-            <w:r>
-              <w:t>Member</w:t>
-            </w:r>
-          </w:p>
-        </w:tc>
-        <w:tc>
-          <w:tcPr>
-            <w:tcW w:w="3360" w:type="pct"/>
-          </w:tcPr>
-          <w:p>
-            <w:pPr>
-              <w:pStyle w:val="Compact"/>
-              <w:jc w:val="both"/>
-            </w:pPr>
-            <w:r>
-              <w:t>Focus</w:t>
+            <w:tcW w:w="3960" w:type="dxa"/>
+          </w:tcPr>
+          <w:p>
+            <w:pPr>
+              <w:pStyle w:val="Compact"/>
+              <w:jc w:val="both"/>
+              <w:rPr>
+                <w:rFonts w:ascii="Times New Roman" w:hAnsi="Times New Roman" w:cs="Times New Roman"/>
+              </w:rPr>
+            </w:pPr>
+            <w:r>
+              <w:rPr>
+                <w:rFonts w:ascii="Times New Roman" w:hAnsi="Times New Roman" w:cs="Times New Roman"/>
+              </w:rPr>
+              <w:t>Layer</w:t>
+            </w:r>
+          </w:p>
+        </w:tc>
+        <w:tc>
+          <w:tcPr>
+            <w:tcW w:w="3960" w:type="dxa"/>
+          </w:tcPr>
+          <w:p>
+            <w:pPr>
+              <w:pStyle w:val="Compact"/>
+              <w:jc w:val="both"/>
+              <w:rPr>
+                <w:rFonts w:ascii="Times New Roman" w:hAnsi="Times New Roman" w:cs="Times New Roman"/>
+              </w:rPr>
+            </w:pPr>
+            <w:r>
+              <w:rPr>
+                <w:rFonts w:ascii="Times New Roman" w:hAnsi="Times New Roman" w:cs="Times New Roman"/>
+              </w:rPr>
+              <w:t>Components</w:t>
             </w:r>
           </w:p>
         </w:tc>
@@ -594,29 +1460,81 @@
       <w:tr>
         <w:tc>
           <w:tcPr>
-            <w:tcW w:w="1640" w:type="pct"/>
-          </w:tcPr>
-          <w:p>
-            <w:pPr>
-              <w:pStyle w:val="Compact"/>
-              <w:jc w:val="both"/>
-            </w:pPr>
-            <w:r>
-              <w:t>Collins Kiptoo (Lead)</w:t>
-            </w:r>
-          </w:p>
-        </w:tc>
-        <w:tc>
-          <w:tcPr>
-            <w:tcW w:w="3360" w:type="pct"/>
-          </w:tcPr>
-          <w:p>
-            <w:pPr>
-              <w:pStyle w:val="Compact"/>
-              <w:jc w:val="both"/>
-            </w:pPr>
-            <w:r>
-              <w:t>Architecture, backend, database, integration</w:t>
+            <w:tcW w:w="3960" w:type="dxa"/>
+          </w:tcPr>
+          <w:p>
+            <w:pPr>
+              <w:pStyle w:val="Compact"/>
+              <w:jc w:val="both"/>
+              <w:rPr>
+                <w:rFonts w:ascii="Times New Roman" w:hAnsi="Times New Roman" w:cs="Times New Roman"/>
+              </w:rPr>
+            </w:pPr>
+            <w:r>
+              <w:rPr>
+                <w:rFonts w:ascii="Times New Roman" w:hAnsi="Times New Roman" w:cs="Times New Roman"/>
+              </w:rPr>
+              <w:t>Shell</w:t>
+            </w:r>
+          </w:p>
+        </w:tc>
+        <w:tc>
+          <w:tcPr>
+            <w:tcW w:w="3960" w:type="dxa"/>
+          </w:tcPr>
+          <w:p>
+            <w:pPr>
+              <w:pStyle w:val="Compact"/>
+              <w:jc w:val="both"/>
+              <w:rPr>
+                <w:rFonts w:ascii="Times New Roman" w:hAnsi="Times New Roman" w:cs="Times New Roman"/>
+              </w:rPr>
+            </w:pPr>
+            <w:r>
+              <w:rPr>
+                <w:rStyle w:val="VerbatimChar"/>
+                <w:rFonts w:ascii="Times New Roman" w:hAnsi="Times New Roman" w:cs="Times New Roman"/>
+              </w:rPr>
+              <w:t>App.jsx</w:t>
+            </w:r>
+            <w:r>
+              <w:rPr>
+                <w:rFonts w:ascii="Times New Roman" w:hAnsi="Times New Roman" w:cs="Times New Roman"/>
+              </w:rPr>
+              <w:t xml:space="preserve"> (routes), </w:t>
+            </w:r>
+            <w:r>
+              <w:rPr>
+                <w:rStyle w:val="VerbatimChar"/>
+                <w:rFonts w:ascii="Times New Roman" w:hAnsi="Times New Roman" w:cs="Times New Roman"/>
+              </w:rPr>
+              <w:t>Navbar</w:t>
+            </w:r>
+            <w:r>
+              <w:rPr>
+                <w:rFonts w:ascii="Times New Roman" w:hAnsi="Times New Roman" w:cs="Times New Roman"/>
+              </w:rPr>
+              <w:t xml:space="preserve">, </w:t>
+            </w:r>
+            <w:r>
+              <w:rPr>
+                <w:rStyle w:val="VerbatimChar"/>
+                <w:rFonts w:ascii="Times New Roman" w:hAnsi="Times New Roman" w:cs="Times New Roman"/>
+              </w:rPr>
+              <w:t>Hero</w:t>
+            </w:r>
+            <w:r>
+              <w:rPr>
+                <w:rFonts w:ascii="Times New Roman" w:hAnsi="Times New Roman" w:cs="Times New Roman"/>
+              </w:rPr>
+              <w:t xml:space="preserve">, </w:t>
+            </w:r>
+            <w:r>
+              <w:rPr>
+                <w:rStyle w:val="VerbatimChar"/>
+                <w:rFonts w:ascii="Times New Roman" w:hAnsi="Times New Roman" w:cs="Times New Roman"/>
+              </w:rPr>
+              <w:t>TrendsHero</w:t>
             </w:r>
           </w:p>
         </w:tc>
@@ -624,29 +1542,87 @@
       <w:tr>
         <w:tc>
           <w:tcPr>
-            <w:tcW w:w="1640" w:type="pct"/>
-          </w:tcPr>
-          <w:p>
-            <w:pPr>
-              <w:pStyle w:val="Compact"/>
-              <w:jc w:val="both"/>
-            </w:pPr>
-            <w:r>
-              <w:t>Shawn Ochieng</w:t>
-            </w:r>
-          </w:p>
-        </w:tc>
-        <w:tc>
-          <w:tcPr>
-            <w:tcW w:w="3360" w:type="pct"/>
-          </w:tcPr>
-          <w:p>
-            <w:pPr>
-              <w:pStyle w:val="Compact"/>
-              <w:jc w:val="both"/>
-            </w:pPr>
-            <w:r>
-              <w:t>Backend API</w:t>
+            <w:tcW w:w="3960" w:type="dxa"/>
+          </w:tcPr>
+          <w:p>
+            <w:pPr>
+              <w:pStyle w:val="Compact"/>
+              <w:jc w:val="both"/>
+              <w:rPr>
+                <w:rFonts w:ascii="Times New Roman" w:hAnsi="Times New Roman" w:cs="Times New Roman"/>
+              </w:rPr>
+            </w:pPr>
+            <w:r>
+              <w:rPr>
+                <w:rFonts w:ascii="Times New Roman" w:hAnsi="Times New Roman" w:cs="Times New Roman"/>
+              </w:rPr>
+              <w:t>Shared UI</w:t>
+            </w:r>
+          </w:p>
+        </w:tc>
+        <w:tc>
+          <w:tcPr>
+            <w:tcW w:w="3960" w:type="dxa"/>
+          </w:tcPr>
+          <w:p>
+            <w:pPr>
+              <w:pStyle w:val="Compact"/>
+              <w:jc w:val="both"/>
+              <w:rPr>
+                <w:rFonts w:ascii="Times New Roman" w:hAnsi="Times New Roman" w:cs="Times New Roman"/>
+              </w:rPr>
+            </w:pPr>
+            <w:r>
+              <w:rPr>
+                <w:rStyle w:val="VerbatimChar"/>
+                <w:rFonts w:ascii="Times New Roman" w:hAnsi="Times New Roman" w:cs="Times New Roman"/>
+              </w:rPr>
+              <w:t>StatCard</w:t>
+            </w:r>
+            <w:r>
+              <w:rPr>
+                <w:rFonts w:ascii="Times New Roman" w:hAnsi="Times New Roman" w:cs="Times New Roman"/>
+              </w:rPr>
+              <w:t xml:space="preserve">, </w:t>
+            </w:r>
+            <w:r>
+              <w:rPr>
+                <w:rStyle w:val="VerbatimChar"/>
+                <w:rFonts w:ascii="Times New Roman" w:hAnsi="Times New Roman" w:cs="Times New Roman"/>
+              </w:rPr>
+              <w:t>Loading</w:t>
+            </w:r>
+            <w:r>
+              <w:rPr>
+                <w:rFonts w:ascii="Times New Roman" w:hAnsi="Times New Roman" w:cs="Times New Roman"/>
+              </w:rPr>
+              <w:t xml:space="preserve">, </w:t>
+            </w:r>
+            <w:r>
+              <w:rPr>
+                <w:rStyle w:val="VerbatimChar"/>
+                <w:rFonts w:ascii="Times New Roman" w:hAnsi="Times New Roman" w:cs="Times New Roman"/>
+              </w:rPr>
+              <w:t>ErrorMessage</w:t>
+            </w:r>
+            <w:r>
+              <w:rPr>
+                <w:rFonts w:ascii="Times New Roman" w:hAnsi="Times New Roman" w:cs="Times New Roman"/>
+              </w:rPr>
+              <w:t xml:space="preserve">, </w:t>
+            </w:r>
+            <w:r>
+              <w:rPr>
+                <w:rStyle w:val="VerbatimChar"/>
+                <w:rFonts w:ascii="Times New Roman" w:hAnsi="Times New Roman" w:cs="Times New Roman"/>
+              </w:rPr>
+              <w:t>RequireAdmin</w:t>
+            </w:r>
+            <w:r>
+              <w:rPr>
+                <w:rFonts w:ascii="Times New Roman" w:hAnsi="Times New Roman" w:cs="Times New Roman"/>
+              </w:rPr>
+              <w:t xml:space="preserve"> (route guard)</w:t>
             </w:r>
           </w:p>
         </w:tc>
@@ -654,30 +1630,81 @@
       <w:tr>
         <w:tc>
           <w:tcPr>
-            <w:tcW w:w="1640" w:type="pct"/>
-          </w:tcPr>
-          <w:p>
-            <w:pPr>
-              <w:pStyle w:val="Compact"/>
-              <w:jc w:val="both"/>
-            </w:pPr>
-            <w:r>
-              <w:lastRenderedPageBreak/>
-              <w:t>Wasaa Abdalla</w:t>
-            </w:r>
-          </w:p>
-        </w:tc>
-        <w:tc>
-          <w:tcPr>
-            <w:tcW w:w="3360" w:type="pct"/>
-          </w:tcPr>
-          <w:p>
-            <w:pPr>
-              <w:pStyle w:val="Compact"/>
-              <w:jc w:val="both"/>
-            </w:pPr>
-            <w:r>
-              <w:t>Frontend integration</w:t>
+            <w:tcW w:w="3960" w:type="dxa"/>
+          </w:tcPr>
+          <w:p>
+            <w:pPr>
+              <w:pStyle w:val="Compact"/>
+              <w:jc w:val="both"/>
+              <w:rPr>
+                <w:rFonts w:ascii="Times New Roman" w:hAnsi="Times New Roman" w:cs="Times New Roman"/>
+              </w:rPr>
+            </w:pPr>
+            <w:r>
+              <w:rPr>
+                <w:rFonts w:ascii="Times New Roman" w:hAnsi="Times New Roman" w:cs="Times New Roman"/>
+              </w:rPr>
+              <w:t>Public pages</w:t>
+            </w:r>
+          </w:p>
+        </w:tc>
+        <w:tc>
+          <w:tcPr>
+            <w:tcW w:w="3960" w:type="dxa"/>
+          </w:tcPr>
+          <w:p>
+            <w:pPr>
+              <w:pStyle w:val="Compact"/>
+              <w:jc w:val="both"/>
+              <w:rPr>
+                <w:rFonts w:ascii="Times New Roman" w:hAnsi="Times New Roman" w:cs="Times New Roman"/>
+              </w:rPr>
+            </w:pPr>
+            <w:r>
+              <w:rPr>
+                <w:rStyle w:val="VerbatimChar"/>
+                <w:rFonts w:ascii="Times New Roman" w:hAnsi="Times New Roman" w:cs="Times New Roman"/>
+              </w:rPr>
+              <w:t>Dashboard</w:t>
+            </w:r>
+            <w:r>
+              <w:rPr>
+                <w:rFonts w:ascii="Times New Roman" w:hAnsi="Times New Roman" w:cs="Times New Roman"/>
+              </w:rPr>
+              <w:t xml:space="preserve">, </w:t>
+            </w:r>
+            <w:r>
+              <w:rPr>
+                <w:rStyle w:val="VerbatimChar"/>
+                <w:rFonts w:ascii="Times New Roman" w:hAnsi="Times New Roman" w:cs="Times New Roman"/>
+              </w:rPr>
+              <w:t>Trends</w:t>
+            </w:r>
+            <w:r>
+              <w:rPr>
+                <w:rFonts w:ascii="Times New Roman" w:hAnsi="Times New Roman" w:cs="Times New Roman"/>
+              </w:rPr>
+              <w:t xml:space="preserve">, </w:t>
+            </w:r>
+            <w:r>
+              <w:rPr>
+                <w:rStyle w:val="VerbatimChar"/>
+                <w:rFonts w:ascii="Times New Roman" w:hAnsi="Times New Roman" w:cs="Times New Roman"/>
+              </w:rPr>
+              <w:t>Compare</w:t>
+            </w:r>
+            <w:r>
+              <w:rPr>
+                <w:rFonts w:ascii="Times New Roman" w:hAnsi="Times New Roman" w:cs="Times New Roman"/>
+              </w:rPr>
+              <w:t xml:space="preserve">, </w:t>
+            </w:r>
+            <w:r>
+              <w:rPr>
+                <w:rStyle w:val="VerbatimChar"/>
+                <w:rFonts w:ascii="Times New Roman" w:hAnsi="Times New Roman" w:cs="Times New Roman"/>
+              </w:rPr>
+              <w:t>Favorites</w:t>
             </w:r>
           </w:p>
         </w:tc>
@@ -685,29 +1712,107 @@
       <w:tr>
         <w:tc>
           <w:tcPr>
-            <w:tcW w:w="1640" w:type="pct"/>
-          </w:tcPr>
-          <w:p>
-            <w:pPr>
-              <w:pStyle w:val="Compact"/>
-              <w:jc w:val="both"/>
-            </w:pPr>
-            <w:r>
-              <w:t>Samuel Wanjau</w:t>
-            </w:r>
-          </w:p>
-        </w:tc>
-        <w:tc>
-          <w:tcPr>
-            <w:tcW w:w="3360" w:type="pct"/>
-          </w:tcPr>
-          <w:p>
-            <w:pPr>
-              <w:pStyle w:val="Compact"/>
-              <w:jc w:val="both"/>
-            </w:pPr>
-            <w:r>
-              <w:t>Frontend features, CRUD UI</w:t>
+            <w:tcW w:w="3960" w:type="dxa"/>
+          </w:tcPr>
+          <w:p>
+            <w:pPr>
+              <w:pStyle w:val="Compact"/>
+              <w:jc w:val="both"/>
+              <w:rPr>
+                <w:rFonts w:ascii="Times New Roman" w:hAnsi="Times New Roman" w:cs="Times New Roman"/>
+              </w:rPr>
+            </w:pPr>
+            <w:r>
+              <w:rPr>
+                <w:rFonts w:ascii="Times New Roman" w:hAnsi="Times New Roman" w:cs="Times New Roman"/>
+              </w:rPr>
+              <w:t>Admin pages</w:t>
+            </w:r>
+          </w:p>
+        </w:tc>
+        <w:tc>
+          <w:tcPr>
+            <w:tcW w:w="3960" w:type="dxa"/>
+          </w:tcPr>
+          <w:p>
+            <w:pPr>
+              <w:pStyle w:val="Compact"/>
+              <w:jc w:val="both"/>
+              <w:rPr>
+                <w:rFonts w:ascii="Times New Roman" w:hAnsi="Times New Roman" w:cs="Times New Roman"/>
+              </w:rPr>
+            </w:pPr>
+            <w:r>
+              <w:rPr>
+                <w:rStyle w:val="VerbatimChar"/>
+                <w:rFonts w:ascii="Times New Roman" w:hAnsi="Times New Roman" w:cs="Times New Roman"/>
+              </w:rPr>
+              <w:t>AdminLogin</w:t>
+            </w:r>
+            <w:r>
+              <w:rPr>
+                <w:rFonts w:ascii="Times New Roman" w:hAnsi="Times New Roman" w:cs="Times New Roman"/>
+              </w:rPr>
+              <w:t xml:space="preserve">, </w:t>
+            </w:r>
+            <w:r>
+              <w:rPr>
+                <w:rStyle w:val="VerbatimChar"/>
+                <w:rFonts w:ascii="Times New Roman" w:hAnsi="Times New Roman" w:cs="Times New Roman"/>
+              </w:rPr>
+              <w:t>AdminDashboard</w:t>
+            </w:r>
+            <w:r>
+              <w:rPr>
+                <w:rFonts w:ascii="Times New Roman" w:hAnsi="Times New Roman" w:cs="Times New Roman"/>
+              </w:rPr>
+              <w:t xml:space="preserve">, </w:t>
+            </w:r>
+            <w:r>
+              <w:rPr>
+                <w:rStyle w:val="VerbatimChar"/>
+                <w:rFonts w:ascii="Times New Roman" w:hAnsi="Times New Roman" w:cs="Times New Roman"/>
+              </w:rPr>
+              <w:t>AdminCountries</w:t>
+            </w:r>
+            <w:r>
+              <w:rPr>
+                <w:rFonts w:ascii="Times New Roman" w:hAnsi="Times New Roman" w:cs="Times New Roman"/>
+              </w:rPr>
+              <w:t xml:space="preserve">, </w:t>
+            </w:r>
+            <w:r>
+              <w:rPr>
+                <w:rStyle w:val="VerbatimChar"/>
+                <w:rFonts w:ascii="Times New Roman" w:hAnsi="Times New Roman" w:cs="Times New Roman"/>
+              </w:rPr>
+              <w:t>AdminIndicators</w:t>
+            </w:r>
+            <w:r>
+              <w:rPr>
+                <w:rFonts w:ascii="Times New Roman" w:hAnsi="Times New Roman" w:cs="Times New Roman"/>
+              </w:rPr>
+              <w:t xml:space="preserve">, </w:t>
+            </w:r>
+            <w:r>
+              <w:rPr>
+                <w:rStyle w:val="VerbatimChar"/>
+                <w:rFonts w:ascii="Times New Roman" w:hAnsi="Times New Roman" w:cs="Times New Roman"/>
+              </w:rPr>
+              <w:t>AdminDataPoints</w:t>
+            </w:r>
+            <w:r>
+              <w:rPr>
+                <w:rFonts w:ascii="Times New Roman" w:hAnsi="Times New Roman" w:cs="Times New Roman"/>
+              </w:rPr>
+              <w:t xml:space="preserve">, </w:t>
+            </w:r>
+            <w:r>
+              <w:rPr>
+                <w:rStyle w:val="VerbatimChar"/>
+                <w:rFonts w:ascii="Times New Roman" w:hAnsi="Times New Roman" w:cs="Times New Roman"/>
+              </w:rPr>
+              <w:t>AdminUsers</w:t>
             </w:r>
           </w:p>
         </w:tc>
@@ -715,29 +1820,48 @@
       <w:tr>
         <w:tc>
           <w:tcPr>
-            <w:tcW w:w="1640" w:type="pct"/>
-          </w:tcPr>
-          <w:p>
-            <w:pPr>
-              <w:pStyle w:val="Compact"/>
-              <w:jc w:val="both"/>
-            </w:pPr>
-            <w:r>
-              <w:t>Rhoda Kinoti</w:t>
-            </w:r>
-          </w:p>
-        </w:tc>
-        <w:tc>
-          <w:tcPr>
-            <w:tcW w:w="3360" w:type="pct"/>
-          </w:tcPr>
-          <w:p>
-            <w:pPr>
-              <w:pStyle w:val="Compact"/>
-              <w:jc w:val="both"/>
-            </w:pPr>
-            <w:r>
-              <w:t>UI/UX, design system, documentation</w:t>
+            <w:tcW w:w="3960" w:type="dxa"/>
+          </w:tcPr>
+          <w:p>
+            <w:pPr>
+              <w:pStyle w:val="Compact"/>
+              <w:jc w:val="both"/>
+              <w:rPr>
+                <w:rFonts w:ascii="Times New Roman" w:hAnsi="Times New Roman" w:cs="Times New Roman"/>
+              </w:rPr>
+            </w:pPr>
+            <w:r>
+              <w:rPr>
+                <w:rFonts w:ascii="Times New Roman" w:hAnsi="Times New Roman" w:cs="Times New Roman"/>
+              </w:rPr>
+              <w:t>Data layer</w:t>
+            </w:r>
+          </w:p>
+        </w:tc>
+        <w:tc>
+          <w:tcPr>
+            <w:tcW w:w="3960" w:type="dxa"/>
+          </w:tcPr>
+          <w:p>
+            <w:pPr>
+              <w:pStyle w:val="Compact"/>
+              <w:jc w:val="both"/>
+              <w:rPr>
+                <w:rFonts w:ascii="Times New Roman" w:hAnsi="Times New Roman" w:cs="Times New Roman"/>
+              </w:rPr>
+            </w:pPr>
+            <w:r>
+              <w:rPr>
+                <w:rStyle w:val="VerbatimChar"/>
+                <w:rFonts w:ascii="Times New Roman" w:hAnsi="Times New Roman" w:cs="Times New Roman"/>
+              </w:rPr>
+              <w:t>services/gho.js</w:t>
+            </w:r>
+            <w:r>
+              <w:rPr>
+                <w:rFonts w:ascii="Times New Roman" w:hAnsi="Times New Roman" w:cs="Times New Roman"/>
+              </w:rPr>
+              <w:t xml:space="preserve"> — single Axios service module all pages call through</w:t>
             </w:r>
           </w:p>
         </w:tc>
@@ -745,13 +1869,342 @@
     </w:tbl>
     <w:p>
       <w:pPr>
-        <w:pStyle w:val="Heading2"/>
-        <w:jc w:val="both"/>
-      </w:pPr>
-      <w:bookmarkStart w:id="8" w:name="whats-next-phase-3"/>
-      <w:bookmarkEnd w:id="7"/>
-      <w:r>
-        <w:t>What’s next (Phase 3)</w:t>
+        <w:pStyle w:val="Heading3"/>
+        <w:jc w:val="both"/>
+        <w:rPr>
+          <w:rFonts w:ascii="Times New Roman" w:hAnsi="Times New Roman" w:cs="Times New Roman"/>
+        </w:rPr>
+      </w:pPr>
+      <w:bookmarkStart w:id="11" w:name="tools-and-technologies"/>
+      <w:bookmarkEnd w:id="10"/>
+      <w:r>
+        <w:rPr>
+          <w:rFonts w:ascii="Times New Roman" w:hAnsi="Times New Roman" w:cs="Times New Roman"/>
+        </w:rPr>
+        <w:t>Tools and technologies</w:t>
+      </w:r>
+    </w:p>
+    <w:tbl>
+      <w:tblPr>
+        <w:tblStyle w:val="GridTable1Light-Accent3"/>
+        <w:tblW w:w="5000" w:type="pct"/>
+        <w:tblLayout w:type="fixed"/>
+        <w:tblLook w:val="0020" w:firstRow="1" w:lastRow="0" w:firstColumn="0" w:lastColumn="0" w:noHBand="0" w:noVBand="0"/>
+      </w:tblPr>
+      <w:tblGrid>
+        <w:gridCol w:w="4788"/>
+        <w:gridCol w:w="4788"/>
+      </w:tblGrid>
+      <w:tr>
+        <w:trPr>
+          <w:cnfStyle w:val="100000000000" w:firstRow="1" w:lastRow="0" w:firstColumn="0" w:lastColumn="0" w:oddVBand="0" w:evenVBand="0" w:oddHBand="0" w:evenHBand="0" w:firstRowFirstColumn="0" w:firstRowLastColumn="0" w:lastRowFirstColumn="0" w:lastRowLastColumn="0"/>
+        </w:trPr>
+        <w:tc>
+          <w:tcPr>
+            <w:tcW w:w="3960" w:type="dxa"/>
+          </w:tcPr>
+          <w:p>
+            <w:pPr>
+              <w:pStyle w:val="Compact"/>
+              <w:jc w:val="both"/>
+              <w:rPr>
+                <w:rFonts w:ascii="Times New Roman" w:hAnsi="Times New Roman" w:cs="Times New Roman"/>
+              </w:rPr>
+            </w:pPr>
+            <w:r>
+              <w:rPr>
+                <w:rFonts w:ascii="Times New Roman" w:hAnsi="Times New Roman" w:cs="Times New Roman"/>
+              </w:rPr>
+              <w:t>Layer</w:t>
+            </w:r>
+          </w:p>
+        </w:tc>
+        <w:tc>
+          <w:tcPr>
+            <w:tcW w:w="3960" w:type="dxa"/>
+          </w:tcPr>
+          <w:p>
+            <w:pPr>
+              <w:pStyle w:val="Compact"/>
+              <w:jc w:val="both"/>
+              <w:rPr>
+                <w:rFonts w:ascii="Times New Roman" w:hAnsi="Times New Roman" w:cs="Times New Roman"/>
+              </w:rPr>
+            </w:pPr>
+            <w:r>
+              <w:rPr>
+                <w:rFonts w:ascii="Times New Roman" w:hAnsi="Times New Roman" w:cs="Times New Roman"/>
+              </w:rPr>
+              <w:t>Choice</w:t>
+            </w:r>
+          </w:p>
+        </w:tc>
+      </w:tr>
+      <w:tr>
+        <w:tc>
+          <w:tcPr>
+            <w:tcW w:w="3960" w:type="dxa"/>
+          </w:tcPr>
+          <w:p>
+            <w:pPr>
+              <w:pStyle w:val="Compact"/>
+              <w:jc w:val="both"/>
+              <w:rPr>
+                <w:rFonts w:ascii="Times New Roman" w:hAnsi="Times New Roman" w:cs="Times New Roman"/>
+              </w:rPr>
+            </w:pPr>
+            <w:r>
+              <w:rPr>
+                <w:rFonts w:ascii="Times New Roman" w:hAnsi="Times New Roman" w:cs="Times New Roman"/>
+              </w:rPr>
+              <w:t>Frontend</w:t>
+            </w:r>
+          </w:p>
+        </w:tc>
+        <w:tc>
+          <w:tcPr>
+            <w:tcW w:w="3960" w:type="dxa"/>
+          </w:tcPr>
+          <w:p>
+            <w:pPr>
+              <w:pStyle w:val="Compact"/>
+              <w:jc w:val="both"/>
+              <w:rPr>
+                <w:rFonts w:ascii="Times New Roman" w:hAnsi="Times New Roman" w:cs="Times New Roman"/>
+              </w:rPr>
+            </w:pPr>
+            <w:r>
+              <w:rPr>
+                <w:rFonts w:ascii="Times New Roman" w:hAnsi="Times New Roman" w:cs="Times New Roman"/>
+              </w:rPr>
+              <w:t>React 19, React Router, Recharts, Axios</w:t>
+            </w:r>
+          </w:p>
+        </w:tc>
+      </w:tr>
+      <w:tr>
+        <w:tc>
+          <w:tcPr>
+            <w:tcW w:w="3960" w:type="dxa"/>
+          </w:tcPr>
+          <w:p>
+            <w:pPr>
+              <w:pStyle w:val="Compact"/>
+              <w:jc w:val="both"/>
+              <w:rPr>
+                <w:rFonts w:ascii="Times New Roman" w:hAnsi="Times New Roman" w:cs="Times New Roman"/>
+              </w:rPr>
+            </w:pPr>
+            <w:r>
+              <w:rPr>
+                <w:rFonts w:ascii="Times New Roman" w:hAnsi="Times New Roman" w:cs="Times New Roman"/>
+              </w:rPr>
+              <w:t>Backend</w:t>
+            </w:r>
+          </w:p>
+        </w:tc>
+        <w:tc>
+          <w:tcPr>
+            <w:tcW w:w="3960" w:type="dxa"/>
+          </w:tcPr>
+          <w:p>
+            <w:pPr>
+              <w:pStyle w:val="Compact"/>
+              <w:jc w:val="both"/>
+              <w:rPr>
+                <w:rFonts w:ascii="Times New Roman" w:hAnsi="Times New Roman" w:cs="Times New Roman"/>
+              </w:rPr>
+            </w:pPr>
+            <w:r>
+              <w:rPr>
+                <w:rFonts w:ascii="Times New Roman" w:hAnsi="Times New Roman" w:cs="Times New Roman"/>
+              </w:rPr>
+              <w:t>Flask, SQLAlchemy, Flask-Migrate, Flask-CORS, marshmallow</w:t>
+            </w:r>
+          </w:p>
+        </w:tc>
+      </w:tr>
+      <w:tr>
+        <w:tc>
+          <w:tcPr>
+            <w:tcW w:w="3960" w:type="dxa"/>
+          </w:tcPr>
+          <w:p>
+            <w:pPr>
+              <w:pStyle w:val="Compact"/>
+              <w:jc w:val="both"/>
+              <w:rPr>
+                <w:rFonts w:ascii="Times New Roman" w:hAnsi="Times New Roman" w:cs="Times New Roman"/>
+              </w:rPr>
+            </w:pPr>
+            <w:r>
+              <w:rPr>
+                <w:rFonts w:ascii="Times New Roman" w:hAnsi="Times New Roman" w:cs="Times New Roman"/>
+              </w:rPr>
+              <w:t>Database</w:t>
+            </w:r>
+          </w:p>
+        </w:tc>
+        <w:tc>
+          <w:tcPr>
+            <w:tcW w:w="3960" w:type="dxa"/>
+          </w:tcPr>
+          <w:p>
+            <w:pPr>
+              <w:pStyle w:val="Compact"/>
+              <w:jc w:val="both"/>
+              <w:rPr>
+                <w:rFonts w:ascii="Times New Roman" w:hAnsi="Times New Roman" w:cs="Times New Roman"/>
+              </w:rPr>
+            </w:pPr>
+            <w:r>
+              <w:rPr>
+                <w:rFonts w:ascii="Times New Roman" w:hAnsi="Times New Roman" w:cs="Times New Roman"/>
+              </w:rPr>
+              <w:t>PostgreSQL</w:t>
+            </w:r>
+          </w:p>
+        </w:tc>
+      </w:tr>
+      <w:tr>
+        <w:tc>
+          <w:tcPr>
+            <w:tcW w:w="3960" w:type="dxa"/>
+          </w:tcPr>
+          <w:p>
+            <w:pPr>
+              <w:pStyle w:val="Compact"/>
+              <w:jc w:val="both"/>
+              <w:rPr>
+                <w:rFonts w:ascii="Times New Roman" w:hAnsi="Times New Roman" w:cs="Times New Roman"/>
+              </w:rPr>
+            </w:pPr>
+            <w:r>
+              <w:rPr>
+                <w:rFonts w:ascii="Times New Roman" w:hAnsi="Times New Roman" w:cs="Times New Roman"/>
+              </w:rPr>
+              <w:t>Auth</w:t>
+            </w:r>
+          </w:p>
+        </w:tc>
+        <w:tc>
+          <w:tcPr>
+            <w:tcW w:w="3960" w:type="dxa"/>
+          </w:tcPr>
+          <w:p>
+            <w:pPr>
+              <w:pStyle w:val="Compact"/>
+              <w:jc w:val="both"/>
+              <w:rPr>
+                <w:rFonts w:ascii="Times New Roman" w:hAnsi="Times New Roman" w:cs="Times New Roman"/>
+              </w:rPr>
+            </w:pPr>
+            <w:r>
+              <w:rPr>
+                <w:rFonts w:ascii="Times New Roman" w:hAnsi="Times New Roman" w:cs="Times New Roman"/>
+              </w:rPr>
+              <w:t>Signed-token admin gate (</w:t>
+            </w:r>
+            <w:r>
+              <w:rPr>
+                <w:rStyle w:val="VerbatimChar"/>
+                <w:rFonts w:ascii="Times New Roman" w:hAnsi="Times New Roman" w:cs="Times New Roman"/>
+              </w:rPr>
+              <w:t>itsdangerous</w:t>
+            </w:r>
+            <w:r>
+              <w:rPr>
+                <w:rFonts w:ascii="Times New Roman" w:hAnsi="Times New Roman" w:cs="Times New Roman"/>
+              </w:rPr>
+              <w:t xml:space="preserve"> + </w:t>
+            </w:r>
+            <w:r>
+              <w:rPr>
+                <w:rStyle w:val="VerbatimChar"/>
+                <w:rFonts w:ascii="Times New Roman" w:hAnsi="Times New Roman" w:cs="Times New Roman"/>
+              </w:rPr>
+              <w:t>werkzeug</w:t>
+            </w:r>
+            <w:r>
+              <w:rPr>
+                <w:rFonts w:ascii="Times New Roman" w:hAnsi="Times New Roman" w:cs="Times New Roman"/>
+              </w:rPr>
+              <w:t>)</w:t>
+            </w:r>
+          </w:p>
+        </w:tc>
+      </w:tr>
+      <w:tr>
+        <w:tc>
+          <w:tcPr>
+            <w:tcW w:w="3960" w:type="dxa"/>
+          </w:tcPr>
+          <w:p>
+            <w:pPr>
+              <w:pStyle w:val="Compact"/>
+              <w:jc w:val="both"/>
+              <w:rPr>
+                <w:rFonts w:ascii="Times New Roman" w:hAnsi="Times New Roman" w:cs="Times New Roman"/>
+              </w:rPr>
+            </w:pPr>
+            <w:r>
+              <w:rPr>
+                <w:rFonts w:ascii="Times New Roman" w:hAnsi="Times New Roman" w:cs="Times New Roman"/>
+              </w:rPr>
+              <w:t>Deployment</w:t>
+            </w:r>
+          </w:p>
+        </w:tc>
+        <w:tc>
+          <w:tcPr>
+            <w:tcW w:w="3960" w:type="dxa"/>
+          </w:tcPr>
+          <w:p>
+            <w:pPr>
+              <w:pStyle w:val="Compact"/>
+              <w:jc w:val="both"/>
+              <w:rPr>
+                <w:rFonts w:ascii="Times New Roman" w:hAnsi="Times New Roman" w:cs="Times New Roman"/>
+              </w:rPr>
+            </w:pPr>
+            <w:r>
+              <w:rPr>
+                <w:rFonts w:ascii="Times New Roman" w:hAnsi="Times New Roman" w:cs="Times New Roman"/>
+              </w:rPr>
+              <w:t xml:space="preserve">Gunicorn + Nginx + Let’s Encrypt (see </w:t>
+            </w:r>
+            <w:r>
+              <w:rPr>
+                <w:rStyle w:val="VerbatimChar"/>
+                <w:rFonts w:ascii="Times New Roman" w:hAnsi="Times New Roman" w:cs="Times New Roman"/>
+              </w:rPr>
+              <w:t>docs/</w:t>
+            </w:r>
+            <w:r>
+              <w:rPr>
+                <w:rFonts w:ascii="Times New Roman" w:hAnsi="Times New Roman" w:cs="Times New Roman"/>
+              </w:rPr>
+              <w:t xml:space="preserve"> deployment notes)</w:t>
+            </w:r>
+          </w:p>
+        </w:tc>
+      </w:tr>
+    </w:tbl>
+    <w:p>
+      <w:pPr>
+        <w:pStyle w:val="Heading3"/>
+        <w:jc w:val="both"/>
+        <w:rPr>
+          <w:rFonts w:ascii="Times New Roman" w:hAnsi="Times New Roman" w:cs="Times New Roman"/>
+        </w:rPr>
+      </w:pPr>
+      <w:bookmarkStart w:id="12" w:name="rubric-alignment"/>
+      <w:bookmarkEnd w:id="11"/>
+      <w:r>
+        <w:rPr>
+          <w:rFonts w:ascii="Times New Roman" w:hAnsi="Times New Roman" w:cs="Times New Roman"/>
+        </w:rPr>
+        <w:t>Rubric alignment</w:t>
       </w:r>
     </w:p>
     <w:p>
@@ -759,12 +2212,26 @@
         <w:pStyle w:val="Compact"/>
         <w:numPr>
           <w:ilvl w:val="0"/>
-          <w:numId w:val="4"/>
+          <w:numId w:val="7"/>
         </w:numPr>
         <w:jc w:val="both"/>
-      </w:pPr>
-      <w:r>
-        <w:t>Full user accounts — not just an admin login, but registered users who can save their own private favorites instead of a shared list.</w:t>
+        <w:rPr>
+          <w:rFonts w:ascii="Times New Roman" w:hAnsi="Times New Roman" w:cs="Times New Roman"/>
+        </w:rPr>
+      </w:pPr>
+      <w:r>
+        <w:rPr>
+          <w:rFonts w:ascii="Times New Roman" w:hAnsi="Times New Roman" w:cs="Times New Roman"/>
+          <w:b/>
+          <w:bCs/>
+        </w:rPr>
+        <w:t>Full CRUD on a custom resource</w:t>
+      </w:r>
+      <w:r>
+        <w:rPr>
+          <w:rFonts w:ascii="Times New Roman" w:hAnsi="Times New Roman" w:cs="Times New Roman"/>
+        </w:rPr>
+        <w:t xml:space="preserve"> — Favorites (create/read/update/delete a bookmark + note), plus full admin CRUD on Countries, Indicators, and Data Points.</w:t>
       </w:r>
     </w:p>
     <w:p>
@@ -772,12 +2239,65 @@
         <w:pStyle w:val="Compact"/>
         <w:numPr>
           <w:ilvl w:val="0"/>
-          <w:numId w:val="4"/>
+          <w:numId w:val="7"/>
         </w:numPr>
         <w:jc w:val="both"/>
-      </w:pPr>
-      <w:r>
-        <w:t>Expand the curated dataset beyond the current 6 countries / 11 indicators as admin usage grows.</w:t>
+        <w:rPr>
+          <w:rFonts w:ascii="Times New Roman" w:hAnsi="Times New Roman" w:cs="Times New Roman"/>
+        </w:rPr>
+      </w:pPr>
+      <w:r>
+        <w:rPr>
+          <w:rFonts w:ascii="Times New Roman" w:hAnsi="Times New Roman" w:cs="Times New Roman"/>
+          <w:b/>
+          <w:bCs/>
+        </w:rPr>
+        <w:t>2+ related resources</w:t>
+      </w:r>
+      <w:r>
+        <w:rPr>
+          <w:rFonts w:ascii="Times New Roman" w:hAnsi="Times New Roman" w:cs="Times New Roman"/>
+        </w:rPr>
+        <w:t xml:space="preserve"> — </w:t>
+      </w:r>
+      <w:r>
+        <w:rPr>
+          <w:rStyle w:val="VerbatimChar"/>
+          <w:rFonts w:ascii="Times New Roman" w:hAnsi="Times New Roman" w:cs="Times New Roman"/>
+        </w:rPr>
+        <w:t>Country</w:t>
+      </w:r>
+      <w:r>
+        <w:rPr>
+          <w:rFonts w:ascii="Times New Roman" w:hAnsi="Times New Roman" w:cs="Times New Roman"/>
+        </w:rPr>
+        <w:t xml:space="preserve">, </w:t>
+      </w:r>
+      <w:r>
+        <w:rPr>
+          <w:rStyle w:val="VerbatimChar"/>
+          <w:rFonts w:ascii="Times New Roman" w:hAnsi="Times New Roman" w:cs="Times New Roman"/>
+        </w:rPr>
+        <w:t>Indicator</w:t>
+      </w:r>
+      <w:r>
+        <w:rPr>
+          <w:rFonts w:ascii="Times New Roman" w:hAnsi="Times New Roman" w:cs="Times New Roman"/>
+        </w:rPr>
+        <w:t xml:space="preserve">, and </w:t>
+      </w:r>
+      <w:r>
+        <w:rPr>
+          <w:rStyle w:val="VerbatimChar"/>
+          <w:rFonts w:ascii="Times New Roman" w:hAnsi="Times New Roman" w:cs="Times New Roman"/>
+        </w:rPr>
+        <w:t>DataPoint</w:t>
+      </w:r>
+      <w:r>
+        <w:rPr>
+          <w:rFonts w:ascii="Times New Roman" w:hAnsi="Times New Roman" w:cs="Times New Roman"/>
+        </w:rPr>
+        <w:t xml:space="preserve"> form a proper relational model with foreign keys and a composite unique constraint, not flat/unrelated tables.</w:t>
       </w:r>
     </w:p>
     <w:p>
@@ -785,15 +2305,1432 @@
         <w:pStyle w:val="Compact"/>
         <w:numPr>
           <w:ilvl w:val="0"/>
-          <w:numId w:val="4"/>
+          <w:numId w:val="7"/>
         </w:numPr>
         <w:jc w:val="both"/>
-      </w:pPr>
-      <w:r>
+        <w:rPr>
+          <w:rFonts w:ascii="Times New Roman" w:hAnsi="Times New Roman" w:cs="Times New Roman"/>
+        </w:rPr>
+      </w:pPr>
+      <w:r>
+        <w:rPr>
+          <w:rFonts w:ascii="Times New Roman" w:hAnsi="Times New Roman" w:cs="Times New Roman"/>
+          <w:b/>
+          <w:bCs/>
+        </w:rPr>
+        <w:lastRenderedPageBreak/>
+        <w:t>SQLAlchemy + migrations</w:t>
+      </w:r>
+      <w:r>
+        <w:rPr>
+          <w:rFonts w:ascii="Times New Roman" w:hAnsi="Times New Roman" w:cs="Times New Roman"/>
+        </w:rPr>
+        <w:t xml:space="preserve"> — every schema change ships as a Flask-Migrate revision, not a hand-edited table.</w:t>
+      </w:r>
+    </w:p>
+    <w:p>
+      <w:pPr>
+        <w:pStyle w:val="Compact"/>
+        <w:numPr>
+          <w:ilvl w:val="0"/>
+          <w:numId w:val="7"/>
+        </w:numPr>
+        <w:jc w:val="both"/>
+        <w:rPr>
+          <w:rFonts w:ascii="Times New Roman" w:hAnsi="Times New Roman" w:cs="Times New Roman"/>
+        </w:rPr>
+      </w:pPr>
+      <w:r>
+        <w:rPr>
+          <w:rFonts w:ascii="Times New Roman" w:hAnsi="Times New Roman" w:cs="Times New Roman"/>
+          <w:b/>
+          <w:bCs/>
+        </w:rPr>
+        <w:t>Error handling</w:t>
+      </w:r>
+      <w:r>
+        <w:rPr>
+          <w:rFonts w:ascii="Times New Roman" w:hAnsi="Times New Roman" w:cs="Times New Roman"/>
+        </w:rPr>
+        <w:t xml:space="preserve"> — every API route returns structured JSON errors; every frontend page has a loading and an error state (</w:t>
+      </w:r>
+      <w:r>
+        <w:rPr>
+          <w:rStyle w:val="VerbatimChar"/>
+          <w:rFonts w:ascii="Times New Roman" w:hAnsi="Times New Roman" w:cs="Times New Roman"/>
+        </w:rPr>
+        <w:t>Loading</w:t>
+      </w:r>
+      <w:r>
+        <w:rPr>
+          <w:rFonts w:ascii="Times New Roman" w:hAnsi="Times New Roman" w:cs="Times New Roman"/>
+        </w:rPr>
+        <w:t xml:space="preserve">, </w:t>
+      </w:r>
+      <w:r>
+        <w:rPr>
+          <w:rStyle w:val="VerbatimChar"/>
+          <w:rFonts w:ascii="Times New Roman" w:hAnsi="Times New Roman" w:cs="Times New Roman"/>
+        </w:rPr>
+        <w:t>ErrorMessage</w:t>
+      </w:r>
+      <w:r>
+        <w:rPr>
+          <w:rFonts w:ascii="Times New Roman" w:hAnsi="Times New Roman" w:cs="Times New Roman"/>
+        </w:rPr>
+        <w:t>).</w:t>
+      </w:r>
+    </w:p>
+    <w:p>
+      <w:pPr>
+        <w:pStyle w:val="Compact"/>
+        <w:numPr>
+          <w:ilvl w:val="0"/>
+          <w:numId w:val="7"/>
+        </w:numPr>
+        <w:jc w:val="both"/>
+        <w:rPr>
+          <w:rFonts w:ascii="Times New Roman" w:hAnsi="Times New Roman" w:cs="Times New Roman"/>
+        </w:rPr>
+      </w:pPr>
+      <w:r>
+        <w:rPr>
+          <w:rFonts w:ascii="Times New Roman" w:hAnsi="Times New Roman" w:cs="Times New Roman"/>
+          <w:b/>
+          <w:bCs/>
+        </w:rPr>
+        <w:t>Clean UI</w:t>
+      </w:r>
+      <w:r>
+        <w:rPr>
+          <w:rFonts w:ascii="Times New Roman" w:hAnsi="Times New Roman" w:cs="Times New Roman"/>
+        </w:rPr>
+        <w:t xml:space="preserve"> — consistent design system (teal theme, sidebar nav) carried over from Phase 1 and extended to the admin section.</w:t>
+      </w:r>
+    </w:p>
+    <w:p>
+      <w:pPr>
+        <w:pStyle w:val="Compact"/>
+        <w:numPr>
+          <w:ilvl w:val="0"/>
+          <w:numId w:val="7"/>
+        </w:numPr>
+        <w:jc w:val="both"/>
+        <w:rPr>
+          <w:rFonts w:ascii="Times New Roman" w:hAnsi="Times New Roman" w:cs="Times New Roman"/>
+        </w:rPr>
+      </w:pPr>
+      <w:r>
+        <w:rPr>
+          <w:rFonts w:ascii="Times New Roman" w:hAnsi="Times New Roman" w:cs="Times New Roman"/>
+          <w:b/>
+          <w:bCs/>
+        </w:rPr>
+        <w:t>Documentation</w:t>
+      </w:r>
+      <w:r>
+        <w:rPr>
+          <w:rFonts w:ascii="Times New Roman" w:hAnsi="Times New Roman" w:cs="Times New Roman"/>
+        </w:rPr>
+        <w:t xml:space="preserve"> — this pitch, backend/frontend READMEs, and team instructions (</w:t>
+      </w:r>
+      <w:r>
+        <w:rPr>
+          <w:rStyle w:val="VerbatimChar"/>
+          <w:rFonts w:ascii="Times New Roman" w:hAnsi="Times New Roman" w:cs="Times New Roman"/>
+        </w:rPr>
+        <w:t>INSTRUCTIONS2.md</w:t>
+      </w:r>
+      <w:r>
+        <w:rPr>
+          <w:rFonts w:ascii="Times New Roman" w:hAnsi="Times New Roman" w:cs="Times New Roman"/>
+        </w:rPr>
+        <w:t>) are kept in the repo.</w:t>
+      </w:r>
+    </w:p>
+    <w:p>
+      <w:pPr>
+        <w:jc w:val="both"/>
+        <w:rPr>
+          <w:rFonts w:ascii="Times New Roman" w:hAnsi="Times New Roman" w:cs="Times New Roman"/>
+        </w:rPr>
+      </w:pPr>
+      <w:r>
+        <w:rPr>
+          <w:noProof/>
+        </w:rPr>
+      </w:r>
+      <w:r>
+        <w:pict w14:anchorId="0C8E9337">
+          <v:rect id="Horizontal Line 3" o:spid="_x0000_s1026" style="width:468pt;height:1.1pt;visibility:visible;mso-wrap-style:square;mso-left-percent:-10001;mso-top-percent:-10001;mso-position-horizontal:absolute;mso-position-horizontal-relative:char;mso-position-vertical:absolute;mso-position-vertical-relative:line;mso-left-percent:-10001;mso-top-percent:-10001;v-text-anchor:top" o:gfxdata="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" filled="f">
+            <o:lock v:ext="edit" rotation="t" aspectratio="t" verticies="t" text="t" shapetype="t"/>
+            <w10:anchorlock/>
+          </v:rect>
+        </w:pict>
+      </w:r>
+    </w:p>
+    <w:p>
+      <w:pPr>
+        <w:pStyle w:val="Heading2"/>
+        <w:jc w:val="both"/>
+        <w:rPr>
+          <w:rFonts w:ascii="Times New Roman" w:hAnsi="Times New Roman" w:cs="Times New Roman"/>
+        </w:rPr>
+      </w:pPr>
+      <w:bookmarkStart w:id="13" w:name="step-3-timeline-and-scope"/>
+      <w:bookmarkEnd w:id="7"/>
+      <w:bookmarkEnd w:id="12"/>
+      <w:r>
+        <w:rPr>
+          <w:rFonts w:ascii="Times New Roman" w:hAnsi="Times New Roman" w:cs="Times New Roman"/>
+        </w:rPr>
+        <w:t>Step 3: Timeline and Scope</w:t>
+      </w:r>
+    </w:p>
+    <w:p>
+      <w:pPr>
+        <w:pStyle w:val="FirstParagraph"/>
+        <w:jc w:val="both"/>
+        <w:rPr>
+          <w:rFonts w:ascii="Times New Roman" w:hAnsi="Times New Roman" w:cs="Times New Roman"/>
+        </w:rPr>
+      </w:pPr>
+      <w:r>
+        <w:rPr>
+          <w:rFonts w:ascii="Times New Roman" w:hAnsi="Times New Roman" w:cs="Times New Roman"/>
+        </w:rPr>
+        <w:t xml:space="preserve">Phase 1 (React + public WHO API) ran June 10–18. Phase 2 (this pitch) covers June 25 – July 2, a </w:t>
+      </w:r>
+      <w:r>
+        <w:rPr>
+          <w:rFonts w:ascii="Times New Roman" w:hAnsi="Times New Roman" w:cs="Times New Roman"/>
+          <w:b/>
+          <w:bCs/>
+        </w:rPr>
+        <w:t>six working-day build</w:t>
+      </w:r>
+      <w:r>
+        <w:rPr>
+          <w:rFonts w:ascii="Times New Roman" w:hAnsi="Times New Roman" w:cs="Times New Roman"/>
+        </w:rPr>
+        <w:t xml:space="preserve">, split across the team by the responsibilities in </w:t>
+      </w:r>
+      <w:r>
+        <w:rPr>
+          <w:rStyle w:val="VerbatimChar"/>
+          <w:rFonts w:ascii="Times New Roman" w:hAnsi="Times New Roman" w:cs="Times New Roman"/>
+        </w:rPr>
+        <w:t>INSTRUCTIONS2.md</w:t>
+      </w:r>
+      <w:r>
+        <w:rPr>
+          <w:rFonts w:ascii="Times New Roman" w:hAnsi="Times New Roman" w:cs="Times New Roman"/>
+        </w:rPr>
+        <w:t>.</w:t>
+      </w:r>
+    </w:p>
+    <w:tbl>
+      <w:tblPr>
+        <w:tblStyle w:val="GridTable1Light-Accent3"/>
+        <w:tblW w:w="5000" w:type="pct"/>
+        <w:tblLayout w:type="fixed"/>
+        <w:tblLook w:val="0020" w:firstRow="1" w:lastRow="0" w:firstColumn="0" w:lastColumn="0" w:noHBand="0" w:noVBand="0"/>
+      </w:tblPr>
+      <w:tblGrid>
+        <w:gridCol w:w="2394"/>
+        <w:gridCol w:w="2394"/>
+        <w:gridCol w:w="2394"/>
+        <w:gridCol w:w="2394"/>
+      </w:tblGrid>
+      <w:tr>
+        <w:trPr>
+          <w:cnfStyle w:val="100000000000" w:firstRow="1" w:lastRow="0" w:firstColumn="0" w:lastColumn="0" w:oddVBand="0" w:evenVBand="0" w:oddHBand="0" w:evenHBand="0" w:firstRowFirstColumn="0" w:firstRowLastColumn="0" w:lastRowFirstColumn="0" w:lastRowLastColumn="0"/>
+        </w:trPr>
+        <w:tc>
+          <w:tcPr>
+            <w:tcW w:w="1980" w:type="dxa"/>
+          </w:tcPr>
+          <w:p>
+            <w:pPr>
+              <w:pStyle w:val="Compact"/>
+              <w:jc w:val="both"/>
+              <w:rPr>
+                <w:rFonts w:ascii="Times New Roman" w:hAnsi="Times New Roman" w:cs="Times New Roman"/>
+              </w:rPr>
+            </w:pPr>
+            <w:r>
+              <w:rPr>
+                <w:rFonts w:ascii="Times New Roman" w:hAnsi="Times New Roman" w:cs="Times New Roman"/>
+              </w:rPr>
+              <w:t>Phase</w:t>
+            </w:r>
+          </w:p>
+        </w:tc>
+        <w:tc>
+          <w:tcPr>
+            <w:tcW w:w="1980" w:type="dxa"/>
+          </w:tcPr>
+          <w:p>
+            <w:pPr>
+              <w:pStyle w:val="Compact"/>
+              <w:jc w:val="both"/>
+              <w:rPr>
+                <w:rFonts w:ascii="Times New Roman" w:hAnsi="Times New Roman" w:cs="Times New Roman"/>
+              </w:rPr>
+            </w:pPr>
+            <w:r>
+              <w:rPr>
+                <w:rFonts w:ascii="Times New Roman" w:hAnsi="Times New Roman" w:cs="Times New Roman"/>
+              </w:rPr>
+              <w:t>Dates</w:t>
+            </w:r>
+          </w:p>
+        </w:tc>
+        <w:tc>
+          <w:tcPr>
+            <w:tcW w:w="1980" w:type="dxa"/>
+          </w:tcPr>
+          <w:p>
+            <w:pPr>
+              <w:pStyle w:val="Compact"/>
+              <w:jc w:val="both"/>
+              <w:rPr>
+                <w:rFonts w:ascii="Times New Roman" w:hAnsi="Times New Roman" w:cs="Times New Roman"/>
+              </w:rPr>
+            </w:pPr>
+            <w:r>
+              <w:rPr>
+                <w:rFonts w:ascii="Times New Roman" w:hAnsi="Times New Roman" w:cs="Times New Roman"/>
+              </w:rPr>
+              <w:t>Est. time</w:t>
+            </w:r>
+          </w:p>
+        </w:tc>
+        <w:tc>
+          <w:tcPr>
+            <w:tcW w:w="1980" w:type="dxa"/>
+          </w:tcPr>
+          <w:p>
+            <w:pPr>
+              <w:pStyle w:val="Compact"/>
+              <w:jc w:val="both"/>
+              <w:rPr>
+                <w:rFonts w:ascii="Times New Roman" w:hAnsi="Times New Roman" w:cs="Times New Roman"/>
+              </w:rPr>
+            </w:pPr>
+            <w:r>
+              <w:rPr>
+                <w:rFonts w:ascii="Times New Roman" w:hAnsi="Times New Roman" w:cs="Times New Roman"/>
+              </w:rPr>
+              <w:t>Focus</w:t>
+            </w:r>
+          </w:p>
+        </w:tc>
+      </w:tr>
+      <w:tr>
+        <w:tc>
+          <w:tcPr>
+            <w:tcW w:w="1980" w:type="dxa"/>
+          </w:tcPr>
+          <w:p>
+            <w:pPr>
+              <w:pStyle w:val="Compact"/>
+              <w:jc w:val="both"/>
+              <w:rPr>
+                <w:rFonts w:ascii="Times New Roman" w:hAnsi="Times New Roman" w:cs="Times New Roman"/>
+              </w:rPr>
+            </w:pPr>
+            <w:r>
+              <w:rPr>
+                <w:rFonts w:ascii="Times New Roman" w:hAnsi="Times New Roman" w:cs="Times New Roman"/>
+              </w:rPr>
+              <w:t>Planning &amp; data modeling</w:t>
+            </w:r>
+          </w:p>
+        </w:tc>
+        <w:tc>
+          <w:tcPr>
+            <w:tcW w:w="1980" w:type="dxa"/>
+          </w:tcPr>
+          <w:p>
+            <w:pPr>
+              <w:pStyle w:val="Compact"/>
+              <w:jc w:val="both"/>
+              <w:rPr>
+                <w:rFonts w:ascii="Times New Roman" w:hAnsi="Times New Roman" w:cs="Times New Roman"/>
+              </w:rPr>
+            </w:pPr>
+            <w:r>
+              <w:rPr>
+                <w:rFonts w:ascii="Times New Roman" w:hAnsi="Times New Roman" w:cs="Times New Roman"/>
+              </w:rPr>
+              <w:t>Jun 25</w:t>
+            </w:r>
+          </w:p>
+        </w:tc>
+        <w:tc>
+          <w:tcPr>
+            <w:tcW w:w="1980" w:type="dxa"/>
+          </w:tcPr>
+          <w:p>
+            <w:pPr>
+              <w:pStyle w:val="Compact"/>
+              <w:jc w:val="both"/>
+              <w:rPr>
+                <w:rFonts w:ascii="Times New Roman" w:hAnsi="Times New Roman" w:cs="Times New Roman"/>
+              </w:rPr>
+            </w:pPr>
+            <w:r>
+              <w:rPr>
+                <w:rFonts w:ascii="Times New Roman" w:hAnsi="Times New Roman" w:cs="Times New Roman"/>
+              </w:rPr>
+              <w:t>0.5 day</w:t>
+            </w:r>
+          </w:p>
+        </w:tc>
+        <w:tc>
+          <w:tcPr>
+            <w:tcW w:w="1980" w:type="dxa"/>
+          </w:tcPr>
+          <w:p>
+            <w:pPr>
+              <w:pStyle w:val="Compact"/>
+              <w:jc w:val="both"/>
+              <w:rPr>
+                <w:rFonts w:ascii="Times New Roman" w:hAnsi="Times New Roman" w:cs="Times New Roman"/>
+              </w:rPr>
+            </w:pPr>
+            <w:r>
+              <w:rPr>
+                <w:rFonts w:ascii="Times New Roman" w:hAnsi="Times New Roman" w:cs="Times New Roman"/>
+              </w:rPr>
+              <w:t>Finalize schema (Country/Indicator/DataPoint/Favorite/User), map old WHO fields to new ones</w:t>
+            </w:r>
+          </w:p>
+        </w:tc>
+      </w:tr>
+      <w:tr>
+        <w:tc>
+          <w:tcPr>
+            <w:tcW w:w="1980" w:type="dxa"/>
+          </w:tcPr>
+          <w:p>
+            <w:pPr>
+              <w:pStyle w:val="Compact"/>
+              <w:jc w:val="both"/>
+              <w:rPr>
+                <w:rFonts w:ascii="Times New Roman" w:hAnsi="Times New Roman" w:cs="Times New Roman"/>
+              </w:rPr>
+            </w:pPr>
+            <w:r>
+              <w:rPr>
+                <w:rFonts w:ascii="Times New Roman" w:hAnsi="Times New Roman" w:cs="Times New Roman"/>
+              </w:rPr>
+              <w:t>Backend setup &amp; modeling</w:t>
+            </w:r>
+          </w:p>
+        </w:tc>
+        <w:tc>
+          <w:tcPr>
+            <w:tcW w:w="1980" w:type="dxa"/>
+          </w:tcPr>
+          <w:p>
+            <w:pPr>
+              <w:pStyle w:val="Compact"/>
+              <w:jc w:val="both"/>
+              <w:rPr>
+                <w:rFonts w:ascii="Times New Roman" w:hAnsi="Times New Roman" w:cs="Times New Roman"/>
+              </w:rPr>
+            </w:pPr>
+            <w:r>
+              <w:rPr>
+                <w:rFonts w:ascii="Times New Roman" w:hAnsi="Times New Roman" w:cs="Times New Roman"/>
+              </w:rPr>
+              <w:t>Jun 25–26</w:t>
+            </w:r>
+          </w:p>
+        </w:tc>
+        <w:tc>
+          <w:tcPr>
+            <w:tcW w:w="1980" w:type="dxa"/>
+          </w:tcPr>
+          <w:p>
+            <w:pPr>
+              <w:pStyle w:val="Compact"/>
+              <w:jc w:val="both"/>
+              <w:rPr>
+                <w:rFonts w:ascii="Times New Roman" w:hAnsi="Times New Roman" w:cs="Times New Roman"/>
+              </w:rPr>
+            </w:pPr>
+            <w:r>
+              <w:rPr>
+                <w:rFonts w:ascii="Times New Roman" w:hAnsi="Times New Roman" w:cs="Times New Roman"/>
+              </w:rPr>
+              <w:t>1.5 days</w:t>
+            </w:r>
+          </w:p>
+        </w:tc>
+        <w:tc>
+          <w:tcPr>
+            <w:tcW w:w="1980" w:type="dxa"/>
+          </w:tcPr>
+          <w:p>
+            <w:pPr>
+              <w:pStyle w:val="Compact"/>
+              <w:jc w:val="both"/>
+              <w:rPr>
+                <w:rFonts w:ascii="Times New Roman" w:hAnsi="Times New Roman" w:cs="Times New Roman"/>
+              </w:rPr>
+            </w:pPr>
+            <w:r>
+              <w:rPr>
+                <w:rFonts w:ascii="Times New Roman" w:hAnsi="Times New Roman" w:cs="Times New Roman"/>
+              </w:rPr>
+              <w:t>Flask app factory, SQLAlchemy models, first Flask-Migrate migrations</w:t>
+            </w:r>
+          </w:p>
+        </w:tc>
+      </w:tr>
+      <w:tr>
+        <w:tc>
+          <w:tcPr>
+            <w:tcW w:w="1980" w:type="dxa"/>
+          </w:tcPr>
+          <w:p>
+            <w:pPr>
+              <w:pStyle w:val="Compact"/>
+              <w:jc w:val="both"/>
+              <w:rPr>
+                <w:rFonts w:ascii="Times New Roman" w:hAnsi="Times New Roman" w:cs="Times New Roman"/>
+              </w:rPr>
+            </w:pPr>
+            <w:r>
+              <w:rPr>
+                <w:rFonts w:ascii="Times New Roman" w:hAnsi="Times New Roman" w:cs="Times New Roman"/>
+              </w:rPr>
+              <w:t>Core CRUD API</w:t>
+            </w:r>
+          </w:p>
+        </w:tc>
+        <w:tc>
+          <w:tcPr>
+            <w:tcW w:w="1980" w:type="dxa"/>
+          </w:tcPr>
+          <w:p>
+            <w:pPr>
+              <w:pStyle w:val="Compact"/>
+              <w:jc w:val="both"/>
+              <w:rPr>
+                <w:rFonts w:ascii="Times New Roman" w:hAnsi="Times New Roman" w:cs="Times New Roman"/>
+              </w:rPr>
+            </w:pPr>
+            <w:r>
+              <w:rPr>
+                <w:rFonts w:ascii="Times New Roman" w:hAnsi="Times New Roman" w:cs="Times New Roman"/>
+              </w:rPr>
+              <w:t>Jun 27–29</w:t>
+            </w:r>
+          </w:p>
+        </w:tc>
+        <w:tc>
+          <w:tcPr>
+            <w:tcW w:w="1980" w:type="dxa"/>
+          </w:tcPr>
+          <w:p>
+            <w:pPr>
+              <w:pStyle w:val="Compact"/>
+              <w:jc w:val="both"/>
+              <w:rPr>
+                <w:rFonts w:ascii="Times New Roman" w:hAnsi="Times New Roman" w:cs="Times New Roman"/>
+              </w:rPr>
+            </w:pPr>
+            <w:r>
+              <w:rPr>
+                <w:rFonts w:ascii="Times New Roman" w:hAnsi="Times New Roman" w:cs="Times New Roman"/>
+              </w:rPr>
+              <w:t>2.5 days</w:t>
+            </w:r>
+          </w:p>
+        </w:tc>
+        <w:tc>
+          <w:tcPr>
+            <w:tcW w:w="1980" w:type="dxa"/>
+          </w:tcPr>
+          <w:p>
+            <w:pPr>
+              <w:pStyle w:val="Compact"/>
+              <w:jc w:val="both"/>
+              <w:rPr>
+                <w:rFonts w:ascii="Times New Roman" w:hAnsi="Times New Roman" w:cs="Times New Roman"/>
+              </w:rPr>
+            </w:pPr>
+            <w:r>
+              <w:rPr>
+                <w:rFonts w:ascii="Times New Roman" w:hAnsi="Times New Roman" w:cs="Times New Roman"/>
+              </w:rPr>
+              <w:t>Routes, schemas, validation, admin auth gate</w:t>
+            </w:r>
+          </w:p>
+        </w:tc>
+      </w:tr>
+      <w:tr>
+        <w:tc>
+          <w:tcPr>
+            <w:tcW w:w="1980" w:type="dxa"/>
+          </w:tcPr>
+          <w:p>
+            <w:pPr>
+              <w:pStyle w:val="Compact"/>
+              <w:jc w:val="both"/>
+              <w:rPr>
+                <w:rFonts w:ascii="Times New Roman" w:hAnsi="Times New Roman" w:cs="Times New Roman"/>
+              </w:rPr>
+            </w:pPr>
+            <w:r>
+              <w:rPr>
+                <w:rFonts w:ascii="Times New Roman" w:hAnsi="Times New Roman" w:cs="Times New Roman"/>
+              </w:rPr>
+              <w:t>Frontend structure &amp; integration</w:t>
+            </w:r>
+          </w:p>
+        </w:tc>
+        <w:tc>
+          <w:tcPr>
+            <w:tcW w:w="1980" w:type="dxa"/>
+          </w:tcPr>
+          <w:p>
+            <w:pPr>
+              <w:pStyle w:val="Compact"/>
+              <w:jc w:val="both"/>
+              <w:rPr>
+                <w:rFonts w:ascii="Times New Roman" w:hAnsi="Times New Roman" w:cs="Times New Roman"/>
+              </w:rPr>
+            </w:pPr>
+            <w:r>
+              <w:rPr>
+                <w:rFonts w:ascii="Times New Roman" w:hAnsi="Times New Roman" w:cs="Times New Roman"/>
+              </w:rPr>
+              <w:t>Jun 27–29</w:t>
+            </w:r>
+          </w:p>
+        </w:tc>
+        <w:tc>
+          <w:tcPr>
+            <w:tcW w:w="1980" w:type="dxa"/>
+          </w:tcPr>
+          <w:p>
+            <w:pPr>
+              <w:pStyle w:val="Compact"/>
+              <w:jc w:val="both"/>
+              <w:rPr>
+                <w:rFonts w:ascii="Times New Roman" w:hAnsi="Times New Roman" w:cs="Times New Roman"/>
+              </w:rPr>
+            </w:pPr>
+            <w:r>
+              <w:rPr>
+                <w:rFonts w:ascii="Times New Roman" w:hAnsi="Times New Roman" w:cs="Times New Roman"/>
+              </w:rPr>
+              <w:t>2.5 days (parallel)</w:t>
+            </w:r>
+          </w:p>
+        </w:tc>
+        <w:tc>
+          <w:tcPr>
+            <w:tcW w:w="1980" w:type="dxa"/>
+          </w:tcPr>
+          <w:p>
+            <w:pPr>
+              <w:pStyle w:val="Compact"/>
+              <w:jc w:val="both"/>
+              <w:rPr>
+                <w:rFonts w:ascii="Times New Roman" w:hAnsi="Times New Roman" w:cs="Times New Roman"/>
+              </w:rPr>
+            </w:pPr>
+            <w:r>
+              <w:rPr>
+                <w:rFonts w:ascii="Times New Roman" w:hAnsi="Times New Roman" w:cs="Times New Roman"/>
+              </w:rPr>
+              <w:t>Replace WHO API calls, build admin CRUD forms and Favorites dashboard</w:t>
+            </w:r>
+          </w:p>
+        </w:tc>
+      </w:tr>
+      <w:tr>
+        <w:tc>
+          <w:tcPr>
+            <w:tcW w:w="1980" w:type="dxa"/>
+          </w:tcPr>
+          <w:p>
+            <w:pPr>
+              <w:pStyle w:val="Compact"/>
+              <w:jc w:val="both"/>
+              <w:rPr>
+                <w:rFonts w:ascii="Times New Roman" w:hAnsi="Times New Roman" w:cs="Times New Roman"/>
+              </w:rPr>
+            </w:pPr>
+            <w:r>
+              <w:rPr>
+                <w:rFonts w:ascii="Times New Roman" w:hAnsi="Times New Roman" w:cs="Times New Roman"/>
+              </w:rPr>
+              <w:t>Debugging &amp; testing</w:t>
+            </w:r>
+          </w:p>
+        </w:tc>
+        <w:tc>
+          <w:tcPr>
+            <w:tcW w:w="1980" w:type="dxa"/>
+          </w:tcPr>
+          <w:p>
+            <w:pPr>
+              <w:pStyle w:val="Compact"/>
+              <w:jc w:val="both"/>
+              <w:rPr>
+                <w:rFonts w:ascii="Times New Roman" w:hAnsi="Times New Roman" w:cs="Times New Roman"/>
+              </w:rPr>
+            </w:pPr>
+            <w:r>
+              <w:rPr>
+                <w:rFonts w:ascii="Times New Roman" w:hAnsi="Times New Roman" w:cs="Times New Roman"/>
+              </w:rPr>
+              <w:t>Jul 1</w:t>
+            </w:r>
+          </w:p>
+        </w:tc>
+        <w:tc>
+          <w:tcPr>
+            <w:tcW w:w="1980" w:type="dxa"/>
+          </w:tcPr>
+          <w:p>
+            <w:pPr>
+              <w:pStyle w:val="Compact"/>
+              <w:jc w:val="both"/>
+              <w:rPr>
+                <w:rFonts w:ascii="Times New Roman" w:hAnsi="Times New Roman" w:cs="Times New Roman"/>
+              </w:rPr>
+            </w:pPr>
+            <w:r>
+              <w:rPr>
+                <w:rFonts w:ascii="Times New Roman" w:hAnsi="Times New Roman" w:cs="Times New Roman"/>
+              </w:rPr>
+              <w:t>1 day</w:t>
+            </w:r>
+          </w:p>
+        </w:tc>
+        <w:tc>
+          <w:tcPr>
+            <w:tcW w:w="1980" w:type="dxa"/>
+          </w:tcPr>
+          <w:p>
+            <w:pPr>
+              <w:pStyle w:val="Compact"/>
+              <w:jc w:val="both"/>
+              <w:rPr>
+                <w:rFonts w:ascii="Times New Roman" w:hAnsi="Times New Roman" w:cs="Times New Roman"/>
+              </w:rPr>
+            </w:pPr>
+            <w:r>
+              <w:rPr>
+                <w:rFonts w:ascii="Times New Roman" w:hAnsi="Times New Roman" w:cs="Times New Roman"/>
+              </w:rPr>
+              <w:t>Merge-conflict resolution across 5 branches, Postman pass on every endpoint</w:t>
+            </w:r>
+          </w:p>
+        </w:tc>
+      </w:tr>
+      <w:tr>
+        <w:tc>
+          <w:tcPr>
+            <w:tcW w:w="1980" w:type="dxa"/>
+          </w:tcPr>
+          <w:p>
+            <w:pPr>
+              <w:pStyle w:val="Compact"/>
+              <w:jc w:val="both"/>
+              <w:rPr>
+                <w:rFonts w:ascii="Times New Roman" w:hAnsi="Times New Roman" w:cs="Times New Roman"/>
+              </w:rPr>
+            </w:pPr>
+            <w:r>
+              <w:rPr>
+                <w:rFonts w:ascii="Times New Roman" w:hAnsi="Times New Roman" w:cs="Times New Roman"/>
+              </w:rPr>
+              <w:t>Deployment</w:t>
+            </w:r>
+          </w:p>
+        </w:tc>
+        <w:tc>
+          <w:tcPr>
+            <w:tcW w:w="1980" w:type="dxa"/>
+          </w:tcPr>
+          <w:p>
+            <w:pPr>
+              <w:pStyle w:val="Compact"/>
+              <w:jc w:val="both"/>
+              <w:rPr>
+                <w:rFonts w:ascii="Times New Roman" w:hAnsi="Times New Roman" w:cs="Times New Roman"/>
+              </w:rPr>
+            </w:pPr>
+            <w:r>
+              <w:rPr>
+                <w:rFonts w:ascii="Times New Roman" w:hAnsi="Times New Roman" w:cs="Times New Roman"/>
+              </w:rPr>
+              <w:t>Jul 2</w:t>
+            </w:r>
+          </w:p>
+        </w:tc>
+        <w:tc>
+          <w:tcPr>
+            <w:tcW w:w="1980" w:type="dxa"/>
+          </w:tcPr>
+          <w:p>
+            <w:pPr>
+              <w:pStyle w:val="Compact"/>
+              <w:jc w:val="both"/>
+              <w:rPr>
+                <w:rFonts w:ascii="Times New Roman" w:hAnsi="Times New Roman" w:cs="Times New Roman"/>
+              </w:rPr>
+            </w:pPr>
+            <w:r>
+              <w:rPr>
+                <w:rFonts w:ascii="Times New Roman" w:hAnsi="Times New Roman" w:cs="Times New Roman"/>
+              </w:rPr>
+              <w:t>0.5 day</w:t>
+            </w:r>
+          </w:p>
+        </w:tc>
+        <w:tc>
+          <w:tcPr>
+            <w:tcW w:w="1980" w:type="dxa"/>
+          </w:tcPr>
+          <w:p>
+            <w:pPr>
+              <w:pStyle w:val="Compact"/>
+              <w:jc w:val="both"/>
+              <w:rPr>
+                <w:rFonts w:ascii="Times New Roman" w:hAnsi="Times New Roman" w:cs="Times New Roman"/>
+              </w:rPr>
+            </w:pPr>
+            <w:r>
+              <w:rPr>
+                <w:rFonts w:ascii="Times New Roman" w:hAnsi="Times New Roman" w:cs="Times New Roman"/>
+              </w:rPr>
+              <w:t>Gunicorn + Nginx + PostgreSQL + TLS on production host</w:t>
+            </w:r>
+          </w:p>
+        </w:tc>
+      </w:tr>
+      <w:tr>
+        <w:tc>
+          <w:tcPr>
+            <w:tcW w:w="1980" w:type="dxa"/>
+          </w:tcPr>
+          <w:p>
+            <w:pPr>
+              <w:pStyle w:val="Compact"/>
+              <w:jc w:val="both"/>
+              <w:rPr>
+                <w:rFonts w:ascii="Times New Roman" w:hAnsi="Times New Roman" w:cs="Times New Roman"/>
+              </w:rPr>
+            </w:pPr>
+            <w:r>
+              <w:rPr>
+                <w:rFonts w:ascii="Times New Roman" w:hAnsi="Times New Roman" w:cs="Times New Roman"/>
+              </w:rPr>
+              <w:t>README, docs &amp; reflection</w:t>
+            </w:r>
+          </w:p>
+        </w:tc>
+        <w:tc>
+          <w:tcPr>
+            <w:tcW w:w="1980" w:type="dxa"/>
+          </w:tcPr>
+          <w:p>
+            <w:pPr>
+              <w:pStyle w:val="Compact"/>
+              <w:jc w:val="both"/>
+              <w:rPr>
+                <w:rFonts w:ascii="Times New Roman" w:hAnsi="Times New Roman" w:cs="Times New Roman"/>
+              </w:rPr>
+            </w:pPr>
+            <w:r>
+              <w:rPr>
+                <w:rFonts w:ascii="Times New Roman" w:hAnsi="Times New Roman" w:cs="Times New Roman"/>
+              </w:rPr>
+              <w:t>Jul 1–2</w:t>
+            </w:r>
+          </w:p>
+        </w:tc>
+        <w:tc>
+          <w:tcPr>
+            <w:tcW w:w="1980" w:type="dxa"/>
+          </w:tcPr>
+          <w:p>
+            <w:pPr>
+              <w:pStyle w:val="Compact"/>
+              <w:jc w:val="both"/>
+              <w:rPr>
+                <w:rFonts w:ascii="Times New Roman" w:hAnsi="Times New Roman" w:cs="Times New Roman"/>
+              </w:rPr>
+            </w:pPr>
+            <w:r>
+              <w:rPr>
+                <w:rFonts w:ascii="Times New Roman" w:hAnsi="Times New Roman" w:cs="Times New Roman"/>
+              </w:rPr>
+              <w:t>0.5 day</w:t>
+            </w:r>
+          </w:p>
+        </w:tc>
+        <w:tc>
+          <w:tcPr>
+            <w:tcW w:w="1980" w:type="dxa"/>
+          </w:tcPr>
+          <w:p>
+            <w:pPr>
+              <w:pStyle w:val="Compact"/>
+              <w:jc w:val="both"/>
+              <w:rPr>
+                <w:rFonts w:ascii="Times New Roman" w:hAnsi="Times New Roman" w:cs="Times New Roman"/>
+              </w:rPr>
+            </w:pPr>
+            <w:r>
+              <w:rPr>
+                <w:rFonts w:ascii="Times New Roman" w:hAnsi="Times New Roman" w:cs="Times New Roman"/>
+              </w:rPr>
+              <w:t>Backend/frontend READMEs, this pitch</w:t>
+            </w:r>
+          </w:p>
+        </w:tc>
+      </w:tr>
+    </w:tbl>
+    <w:p>
+      <w:pPr>
+        <w:pStyle w:val="Heading3"/>
+        <w:jc w:val="both"/>
+        <w:rPr>
+          <w:rFonts w:ascii="Times New Roman" w:hAnsi="Times New Roman" w:cs="Times New Roman"/>
+        </w:rPr>
+      </w:pPr>
+      <w:bookmarkStart w:id="14" w:name="risks-and-open-questions"/>
+      <w:r>
+        <w:rPr>
+          <w:rFonts w:ascii="Times New Roman" w:hAnsi="Times New Roman" w:cs="Times New Roman"/>
+        </w:rPr>
+        <w:lastRenderedPageBreak/>
+        <w:t>Risks and open questions</w:t>
+      </w:r>
+    </w:p>
+    <w:p>
+      <w:pPr>
+        <w:pStyle w:val="Compact"/>
+        <w:numPr>
+          <w:ilvl w:val="0"/>
+          <w:numId w:val="8"/>
+        </w:numPr>
+        <w:jc w:val="both"/>
+        <w:rPr>
+          <w:rFonts w:ascii="Times New Roman" w:hAnsi="Times New Roman" w:cs="Times New Roman"/>
+        </w:rPr>
+      </w:pPr>
+      <w:r>
+        <w:rPr>
+          <w:rFonts w:ascii="Times New Roman" w:hAnsi="Times New Roman" w:cs="Times New Roman"/>
+          <w:b/>
+          <w:bCs/>
+        </w:rPr>
+        <w:t>CORS between Vite dev server and Flask API</w:t>
+      </w:r>
+      <w:r>
+        <w:rPr>
+          <w:rFonts w:ascii="Times New Roman" w:hAnsi="Times New Roman" w:cs="Times New Roman"/>
+        </w:rPr>
+        <w:t xml:space="preserve"> required real debugging time (see </w:t>
+      </w:r>
+      <w:r>
+        <w:rPr>
+          <w:rStyle w:val="VerbatimChar"/>
+          <w:rFonts w:ascii="Times New Roman" w:hAnsi="Times New Roman" w:cs="Times New Roman"/>
+        </w:rPr>
+        <w:t>bugs/cors-errors</w:t>
+      </w:r>
+      <w:r>
+        <w:rPr>
+          <w:rFonts w:ascii="Times New Roman" w:hAnsi="Times New Roman" w:cs="Times New Roman"/>
+        </w:rPr>
+        <w:t xml:space="preserve"> branch) — budgeted for but still slower than expected.</w:t>
+      </w:r>
+    </w:p>
+    <w:p>
+      <w:pPr>
+        <w:pStyle w:val="Compact"/>
+        <w:numPr>
+          <w:ilvl w:val="0"/>
+          <w:numId w:val="8"/>
+        </w:numPr>
+        <w:jc w:val="both"/>
+        <w:rPr>
+          <w:rFonts w:ascii="Times New Roman" w:hAnsi="Times New Roman" w:cs="Times New Roman"/>
+        </w:rPr>
+      </w:pPr>
+      <w:r>
+        <w:rPr>
+          <w:rFonts w:ascii="Times New Roman" w:hAnsi="Times New Roman" w:cs="Times New Roman"/>
+          <w:b/>
+          <w:bCs/>
+        </w:rPr>
+        <w:t>Nginx reverse-proxy routing</w:t>
+      </w:r>
+      <w:r>
+        <w:rPr>
+          <w:rFonts w:ascii="Times New Roman" w:hAnsi="Times New Roman" w:cs="Times New Roman"/>
+        </w:rPr>
+        <w:t xml:space="preserve"> for the production API needed research the first time we deployed — now documented so it isn’t a repeat cost.</w:t>
+      </w:r>
+    </w:p>
+    <w:p>
+      <w:pPr>
+        <w:pStyle w:val="Compact"/>
+        <w:numPr>
+          <w:ilvl w:val="0"/>
+          <w:numId w:val="8"/>
+        </w:numPr>
+        <w:jc w:val="both"/>
+        <w:rPr>
+          <w:rFonts w:ascii="Times New Roman" w:hAnsi="Times New Roman" w:cs="Times New Roman"/>
+        </w:rPr>
+      </w:pPr>
+      <w:r>
+        <w:rPr>
+          <w:rFonts w:ascii="Times New Roman" w:hAnsi="Times New Roman" w:cs="Times New Roman"/>
+          <w:b/>
+          <w:bCs/>
+        </w:rPr>
+        <w:t>Coordinating 5 people across parallel feature branches</w:t>
+      </w:r>
+      <w:r>
+        <w:rPr>
+          <w:rFonts w:ascii="Times New Roman" w:hAnsi="Times New Roman" w:cs="Times New Roman"/>
+        </w:rPr>
+        <w:t xml:space="preserve"> produced merge conflicts that ate into the debugging day; a stricter PR-review cadence (per </w:t>
+      </w:r>
+      <w:r>
+        <w:rPr>
+          <w:rStyle w:val="VerbatimChar"/>
+          <w:rFonts w:ascii="Times New Roman" w:hAnsi="Times New Roman" w:cs="Times New Roman"/>
+        </w:rPr>
+        <w:t>INSTRUCTIONS2.md</w:t>
+      </w:r>
+      <w:r>
+        <w:rPr>
+          <w:rFonts w:ascii="Times New Roman" w:hAnsi="Times New Roman" w:cs="Times New Roman"/>
+        </w:rPr>
+        <w:t>) is the mitigation going forward.</w:t>
+      </w:r>
+    </w:p>
+    <w:p>
+      <w:pPr>
+        <w:pStyle w:val="Compact"/>
+        <w:numPr>
+          <w:ilvl w:val="0"/>
+          <w:numId w:val="8"/>
+        </w:numPr>
+        <w:jc w:val="both"/>
+        <w:rPr>
+          <w:rFonts w:ascii="Times New Roman" w:hAnsi="Times New Roman" w:cs="Times New Roman"/>
+        </w:rPr>
+      </w:pPr>
+      <w:r>
+        <w:rPr>
+          <w:rFonts w:ascii="Times New Roman" w:hAnsi="Times New Roman" w:cs="Times New Roman"/>
+          <w:b/>
+          <w:bCs/>
+        </w:rPr>
+        <w:t xml:space="preserve">Admin token is stored in </w:t>
+      </w:r>
+      <w:r>
+        <w:rPr>
+          <w:rStyle w:val="VerbatimChar"/>
+          <w:rFonts w:ascii="Times New Roman" w:hAnsi="Times New Roman" w:cs="Times New Roman"/>
+          <w:b/>
+          <w:bCs/>
+        </w:rPr>
+        <w:t>localStorage</w:t>
+      </w:r>
+      <w:r>
+        <w:rPr>
+          <w:rFonts w:ascii="Times New Roman" w:hAnsi="Times New Roman" w:cs="Times New Roman"/>
+        </w:rPr>
+        <w:t xml:space="preserve"> — acceptable for Phase 2’s single-admin scope, but flagged as a Phase 3 hardening item once real user accounts exist.</w:t>
+      </w:r>
+    </w:p>
+    <w:p>
+      <w:pPr>
+        <w:pStyle w:val="Heading3"/>
+        <w:jc w:val="both"/>
+        <w:rPr>
+          <w:rFonts w:ascii="Times New Roman" w:hAnsi="Times New Roman" w:cs="Times New Roman"/>
+        </w:rPr>
+      </w:pPr>
+      <w:bookmarkStart w:id="15" w:name="whats-next-phase-3"/>
+      <w:bookmarkEnd w:id="14"/>
+      <w:r>
+        <w:rPr>
+          <w:rFonts w:ascii="Times New Roman" w:hAnsi="Times New Roman" w:cs="Times New Roman"/>
+        </w:rPr>
+        <w:t>What’s next (Phase 3)</w:t>
+      </w:r>
+    </w:p>
+    <w:p>
+      <w:pPr>
+        <w:pStyle w:val="Compact"/>
+        <w:numPr>
+          <w:ilvl w:val="0"/>
+          <w:numId w:val="9"/>
+        </w:numPr>
+        <w:jc w:val="both"/>
+        <w:rPr>
+          <w:rFonts w:ascii="Times New Roman" w:hAnsi="Times New Roman" w:cs="Times New Roman"/>
+        </w:rPr>
+      </w:pPr>
+      <w:r>
+        <w:rPr>
+          <w:rFonts w:ascii="Times New Roman" w:hAnsi="Times New Roman" w:cs="Times New Roman"/>
+        </w:rPr>
+        <w:t>Full user accounts — registered users with their own private Favorites, not a single shared admin login.</w:t>
+      </w:r>
+    </w:p>
+    <w:p>
+      <w:pPr>
+        <w:pStyle w:val="Compact"/>
+        <w:numPr>
+          <w:ilvl w:val="0"/>
+          <w:numId w:val="9"/>
+        </w:numPr>
+        <w:jc w:val="both"/>
+        <w:rPr>
+          <w:rFonts w:ascii="Times New Roman" w:hAnsi="Times New Roman" w:cs="Times New Roman"/>
+        </w:rPr>
+      </w:pPr>
+      <w:r>
+        <w:rPr>
+          <w:rFonts w:ascii="Times New Roman" w:hAnsi="Times New Roman" w:cs="Times New Roman"/>
+        </w:rPr>
+        <w:t>Expand the curated dataset beyond the current 6 countries / 11 indicators as admin usage grows.</w:t>
+      </w:r>
+    </w:p>
+    <w:p>
+      <w:pPr>
+        <w:pStyle w:val="Compact"/>
+        <w:numPr>
+          <w:ilvl w:val="0"/>
+          <w:numId w:val="9"/>
+        </w:numPr>
+        <w:jc w:val="both"/>
+        <w:rPr>
+          <w:rFonts w:ascii="Times New Roman" w:hAnsi="Times New Roman" w:cs="Times New Roman"/>
+        </w:rPr>
+      </w:pPr>
+      <w:r>
+        <w:rPr>
+          <w:rFonts w:ascii="Times New Roman" w:hAnsi="Times New Roman" w:cs="Times New Roman"/>
+        </w:rPr>
         <w:t>Role-based permissions beyond a single admin flag.</w:t>
       </w:r>
+      <w:bookmarkStart w:id="16" w:name="team"/>
+      <w:bookmarkEnd w:id="13"/>
+      <w:bookmarkEnd w:id="15"/>
+    </w:p>
+    <w:p>
+      <w:pPr>
+        <w:pStyle w:val="Heading2"/>
+        <w:jc w:val="both"/>
+        <w:rPr>
+          <w:rFonts w:ascii="Times New Roman" w:hAnsi="Times New Roman" w:cs="Times New Roman"/>
+        </w:rPr>
+      </w:pPr>
+      <w:r>
+        <w:rPr>
+          <w:rFonts w:ascii="Times New Roman" w:hAnsi="Times New Roman" w:cs="Times New Roman"/>
+        </w:rPr>
+        <w:t>Team</w:t>
+      </w:r>
+    </w:p>
+    <w:tbl>
+      <w:tblPr>
+        <w:tblStyle w:val="Table"/>
+        <w:tblW w:w="5000" w:type="pct"/>
+        <w:tblLayout w:type="fixed"/>
+        <w:tblLook w:val="0020" w:firstRow="1" w:lastRow="0" w:firstColumn="0" w:lastColumn="0" w:noHBand="0" w:noVBand="0"/>
+      </w:tblPr>
+      <w:tblGrid>
+        <w:gridCol w:w="4788"/>
+        <w:gridCol w:w="4788"/>
+      </w:tblGrid>
+      <w:tr>
+        <w:trPr>
+          <w:cnfStyle w:val="100000000000" w:firstRow="1" w:lastRow="0" w:firstColumn="0" w:lastColumn="0" w:oddVBand="0" w:evenVBand="0" w:oddHBand="0" w:evenHBand="0" w:firstRowFirstColumn="0" w:firstRowLastColumn="0" w:lastRowFirstColumn="0" w:lastRowLastColumn="0"/>
+          <w:tblHeader/>
+        </w:trPr>
+        <w:tc>
+          <w:tcPr>
+            <w:tcW w:w="3960" w:type="dxa"/>
+          </w:tcPr>
+          <w:p>
+            <w:pPr>
+              <w:pStyle w:val="Compact"/>
+              <w:jc w:val="both"/>
+              <w:rPr>
+                <w:rFonts w:ascii="Times New Roman" w:hAnsi="Times New Roman" w:cs="Times New Roman"/>
+              </w:rPr>
+            </w:pPr>
+            <w:r>
+              <w:rPr>
+                <w:rFonts w:ascii="Times New Roman" w:hAnsi="Times New Roman" w:cs="Times New Roman"/>
+              </w:rPr>
+              <w:t>Member</w:t>
+            </w:r>
+          </w:p>
+        </w:tc>
+        <w:tc>
+          <w:tcPr>
+            <w:tcW w:w="3960" w:type="dxa"/>
+          </w:tcPr>
+          <w:p>
+            <w:pPr>
+              <w:pStyle w:val="Compact"/>
+              <w:jc w:val="both"/>
+              <w:rPr>
+                <w:rFonts w:ascii="Times New Roman" w:hAnsi="Times New Roman" w:cs="Times New Roman"/>
+              </w:rPr>
+            </w:pPr>
+            <w:r>
+              <w:rPr>
+                <w:rFonts w:ascii="Times New Roman" w:hAnsi="Times New Roman" w:cs="Times New Roman"/>
+              </w:rPr>
+              <w:t>Focus</w:t>
+            </w:r>
+          </w:p>
+        </w:tc>
+      </w:tr>
+      <w:tr>
+        <w:tc>
+          <w:tcPr>
+            <w:tcW w:w="3960" w:type="dxa"/>
+          </w:tcPr>
+          <w:p>
+            <w:pPr>
+              <w:pStyle w:val="Compact"/>
+              <w:jc w:val="both"/>
+              <w:rPr>
+                <w:rFonts w:ascii="Times New Roman" w:hAnsi="Times New Roman" w:cs="Times New Roman"/>
+              </w:rPr>
+            </w:pPr>
+            <w:r>
+              <w:rPr>
+                <w:rFonts w:ascii="Times New Roman" w:hAnsi="Times New Roman" w:cs="Times New Roman"/>
+              </w:rPr>
+              <w:t>Collins Kiptoo (Lead)</w:t>
+            </w:r>
+          </w:p>
+        </w:tc>
+        <w:tc>
+          <w:tcPr>
+            <w:tcW w:w="3960" w:type="dxa"/>
+          </w:tcPr>
+          <w:p>
+            <w:pPr>
+              <w:pStyle w:val="Compact"/>
+              <w:jc w:val="both"/>
+              <w:rPr>
+                <w:rFonts w:ascii="Times New Roman" w:hAnsi="Times New Roman" w:cs="Times New Roman"/>
+              </w:rPr>
+            </w:pPr>
+            <w:r>
+              <w:rPr>
+                <w:rFonts w:ascii="Times New Roman" w:hAnsi="Times New Roman" w:cs="Times New Roman"/>
+              </w:rPr>
+              <w:t>Architecture, backend, database, integration, deployment</w:t>
+            </w:r>
+          </w:p>
+        </w:tc>
+      </w:tr>
+      <w:tr>
+        <w:tc>
+          <w:tcPr>
+            <w:tcW w:w="3960" w:type="dxa"/>
+          </w:tcPr>
+          <w:p>
+            <w:pPr>
+              <w:pStyle w:val="Compact"/>
+              <w:jc w:val="both"/>
+              <w:rPr>
+                <w:rFonts w:ascii="Times New Roman" w:hAnsi="Times New Roman" w:cs="Times New Roman"/>
+              </w:rPr>
+            </w:pPr>
+            <w:r>
+              <w:rPr>
+                <w:rFonts w:ascii="Times New Roman" w:hAnsi="Times New Roman" w:cs="Times New Roman"/>
+              </w:rPr>
+              <w:t>Shawn Ochieng</w:t>
+            </w:r>
+          </w:p>
+        </w:tc>
+        <w:tc>
+          <w:tcPr>
+            <w:tcW w:w="3960" w:type="dxa"/>
+          </w:tcPr>
+          <w:p>
+            <w:pPr>
+              <w:pStyle w:val="Compact"/>
+              <w:jc w:val="both"/>
+              <w:rPr>
+                <w:rFonts w:ascii="Times New Roman" w:hAnsi="Times New Roman" w:cs="Times New Roman"/>
+              </w:rPr>
+            </w:pPr>
+            <w:r>
+              <w:rPr>
+                <w:rFonts w:ascii="Times New Roman" w:hAnsi="Times New Roman" w:cs="Times New Roman"/>
+              </w:rPr>
+              <w:t>Backend API</w:t>
+            </w:r>
+          </w:p>
+        </w:tc>
+      </w:tr>
+      <w:tr>
+        <w:tc>
+          <w:tcPr>
+            <w:tcW w:w="3960" w:type="dxa"/>
+          </w:tcPr>
+          <w:p>
+            <w:pPr>
+              <w:pStyle w:val="Compact"/>
+              <w:jc w:val="both"/>
+              <w:rPr>
+                <w:rFonts w:ascii="Times New Roman" w:hAnsi="Times New Roman" w:cs="Times New Roman"/>
+              </w:rPr>
+            </w:pPr>
+            <w:r>
+              <w:rPr>
+                <w:rFonts w:ascii="Times New Roman" w:hAnsi="Times New Roman" w:cs="Times New Roman"/>
+              </w:rPr>
+              <w:t>Wasaa Abdalla</w:t>
+            </w:r>
+          </w:p>
+        </w:tc>
+        <w:tc>
+          <w:tcPr>
+            <w:tcW w:w="3960" w:type="dxa"/>
+          </w:tcPr>
+          <w:p>
+            <w:pPr>
+              <w:pStyle w:val="Compact"/>
+              <w:jc w:val="both"/>
+              <w:rPr>
+                <w:rFonts w:ascii="Times New Roman" w:hAnsi="Times New Roman" w:cs="Times New Roman"/>
+              </w:rPr>
+            </w:pPr>
+            <w:r>
+              <w:rPr>
+                <w:rFonts w:ascii="Times New Roman" w:hAnsi="Times New Roman" w:cs="Times New Roman"/>
+              </w:rPr>
+              <w:t>Frontend integration</w:t>
+            </w:r>
+          </w:p>
+        </w:tc>
+      </w:tr>
+      <w:tr>
+        <w:tc>
+          <w:tcPr>
+            <w:tcW w:w="3960" w:type="dxa"/>
+          </w:tcPr>
+          <w:p>
+            <w:pPr>
+              <w:pStyle w:val="Compact"/>
+              <w:jc w:val="both"/>
+              <w:rPr>
+                <w:rFonts w:ascii="Times New Roman" w:hAnsi="Times New Roman" w:cs="Times New Roman"/>
+              </w:rPr>
+            </w:pPr>
+            <w:r>
+              <w:rPr>
+                <w:rFonts w:ascii="Times New Roman" w:hAnsi="Times New Roman" w:cs="Times New Roman"/>
+              </w:rPr>
+              <w:t>Samuel Wanjau</w:t>
+            </w:r>
+          </w:p>
+        </w:tc>
+        <w:tc>
+          <w:tcPr>
+            <w:tcW w:w="3960" w:type="dxa"/>
+          </w:tcPr>
+          <w:p>
+            <w:pPr>
+              <w:pStyle w:val="Compact"/>
+              <w:jc w:val="both"/>
+              <w:rPr>
+                <w:rFonts w:ascii="Times New Roman" w:hAnsi="Times New Roman" w:cs="Times New Roman"/>
+              </w:rPr>
+            </w:pPr>
+            <w:r>
+              <w:rPr>
+                <w:rFonts w:ascii="Times New Roman" w:hAnsi="Times New Roman" w:cs="Times New Roman"/>
+              </w:rPr>
+              <w:t>Frontend features, CRUD UI</w:t>
+            </w:r>
+          </w:p>
+        </w:tc>
+      </w:tr>
+      <w:tr>
+        <w:tc>
+          <w:tcPr>
+            <w:tcW w:w="3960" w:type="dxa"/>
+          </w:tcPr>
+          <w:p>
+            <w:pPr>
+              <w:pStyle w:val="Compact"/>
+              <w:jc w:val="both"/>
+              <w:rPr>
+                <w:rFonts w:ascii="Times New Roman" w:hAnsi="Times New Roman" w:cs="Times New Roman"/>
+              </w:rPr>
+            </w:pPr>
+            <w:r>
+              <w:rPr>
+                <w:rFonts w:ascii="Times New Roman" w:hAnsi="Times New Roman" w:cs="Times New Roman"/>
+              </w:rPr>
+              <w:t>Rhoda Kinoti</w:t>
+            </w:r>
+          </w:p>
+        </w:tc>
+        <w:tc>
+          <w:tcPr>
+            <w:tcW w:w="3960" w:type="dxa"/>
+          </w:tcPr>
+          <w:p>
+            <w:pPr>
+              <w:pStyle w:val="Compact"/>
+              <w:jc w:val="both"/>
+              <w:rPr>
+                <w:rFonts w:ascii="Times New Roman" w:hAnsi="Times New Roman" w:cs="Times New Roman"/>
+              </w:rPr>
+            </w:pPr>
+            <w:r>
+              <w:rPr>
+                <w:rFonts w:ascii="Times New Roman" w:hAnsi="Times New Roman" w:cs="Times New Roman"/>
+              </w:rPr>
+              <w:t>UI/UX, design system, documentation</w:t>
+            </w:r>
+          </w:p>
+        </w:tc>
+      </w:tr>
       <w:bookmarkEnd w:id="0"/>
-      <w:bookmarkEnd w:id="8"/>
+      <w:bookmarkEnd w:id="16"/>
+    </w:tbl>
+    <w:p>
+      <w:pPr>
+        <w:jc w:val="both"/>
+        <w:rPr>
+          <w:rFonts w:ascii="Times New Roman" w:hAnsi="Times New Roman" w:cs="Times New Roman"/>
+        </w:rPr>
+      </w:pPr>
     </w:p>
     <w:sectPr>
       <w:footnotePr>
@@ -812,7 +3749,7 @@
   <w:abstractNum w:abstractNumId="0" w15:restartNumberingAfterBreak="0">
     <w:nsid w:val="0000A990"/>
     <w:multiLevelType w:val="multilevel"/>
-    <w:tmpl w:val="21D43D18"/>
+    <w:tmpl w:val="744E4F98"/>
     <w:lvl w:ilvl="0">
       <w:numFmt w:val="bullet"/>
       <w:lvlText w:val=" "/>
@@ -889,7 +3826,7 @@
   <w:abstractNum w:abstractNumId="1" w15:restartNumberingAfterBreak="0">
     <w:nsid w:val="0000A991"/>
     <w:multiLevelType w:val="multilevel"/>
-    <w:tmpl w:val="82D0C444"/>
+    <w:tmpl w:val="C8E482A6"/>
     <w:lvl w:ilvl="0">
       <w:numFmt w:val="bullet"/>
       <w:lvlText w:val=""/>
@@ -990,16 +3927,171 @@
       </w:rPr>
     </w:lvl>
   </w:abstractNum>
-  <w:num w:numId="1" w16cid:durableId="1983343344">
+  <w:abstractNum w:abstractNumId="2" w15:restartNumberingAfterBreak="0">
+    <w:nsid w:val="00A99411"/>
+    <w:multiLevelType w:val="multilevel"/>
+    <w:tmpl w:val="6FA0A708"/>
+    <w:lvl w:ilvl="0">
+      <w:start w:val="1"/>
+      <w:numFmt w:val="decimal"/>
+      <w:lvlText w:val="%1."/>
+      <w:lvlJc w:val="left"/>
+      <w:pPr>
+        <w:ind w:left="720" w:hanging="360"/>
+      </w:pPr>
+    </w:lvl>
+    <w:lvl w:ilvl="1">
+      <w:start w:val="1"/>
+      <w:numFmt w:val="decimal"/>
+      <w:lvlText w:val="%2."/>
+      <w:lvlJc w:val="left"/>
+      <w:pPr>
+        <w:ind w:left="1440" w:hanging="360"/>
+      </w:pPr>
+    </w:lvl>
+    <w:lvl w:ilvl="2">
+      <w:start w:val="1"/>
+      <w:numFmt w:val="decimal"/>
+      <w:lvlText w:val="%3."/>
+      <w:lvlJc w:val="left"/>
+      <w:pPr>
+        <w:ind w:left="2160" w:hanging="360"/>
+      </w:pPr>
+    </w:lvl>
+    <w:lvl w:ilvl="3">
+      <w:start w:val="1"/>
+      <w:numFmt w:val="decimal"/>
+      <w:lvlText w:val="%4."/>
+      <w:lvlJc w:val="left"/>
+      <w:pPr>
+        <w:ind w:left="2880" w:hanging="360"/>
+      </w:pPr>
+    </w:lvl>
+    <w:lvl w:ilvl="4">
+      <w:start w:val="1"/>
+      <w:numFmt w:val="decimal"/>
+      <w:lvlText w:val="%5."/>
+      <w:lvlJc w:val="left"/>
+      <w:pPr>
+        <w:ind w:left="3600" w:hanging="360"/>
+      </w:pPr>
+    </w:lvl>
+    <w:lvl w:ilvl="5">
+      <w:start w:val="1"/>
+      <w:numFmt w:val="decimal"/>
+      <w:lvlText w:val="%6."/>
+      <w:lvlJc w:val="left"/>
+      <w:pPr>
+        <w:ind w:left="4320" w:hanging="360"/>
+      </w:pPr>
+    </w:lvl>
+    <w:lvl w:ilvl="6">
+      <w:start w:val="1"/>
+      <w:numFmt w:val="decimal"/>
+      <w:lvlText w:val="%7."/>
+      <w:lvlJc w:val="left"/>
+      <w:pPr>
+        <w:ind w:left="5040" w:hanging="360"/>
+      </w:pPr>
+    </w:lvl>
+    <w:lvl w:ilvl="7">
+      <w:start w:val="1"/>
+      <w:numFmt w:val="decimal"/>
+      <w:lvlText w:val="%8."/>
+      <w:lvlJc w:val="left"/>
+      <w:pPr>
+        <w:ind w:left="5760" w:hanging="360"/>
+      </w:pPr>
+    </w:lvl>
+    <w:lvl w:ilvl="8">
+      <w:start w:val="1"/>
+      <w:numFmt w:val="decimal"/>
+      <w:lvlText w:val="%9."/>
+      <w:lvlJc w:val="left"/>
+      <w:pPr>
+        <w:ind w:left="6480" w:hanging="360"/>
+      </w:pPr>
+    </w:lvl>
+  </w:abstractNum>
+  <w:num w:numId="1" w16cid:durableId="2132017475">
     <w:abstractNumId w:val="0"/>
   </w:num>
-  <w:num w:numId="2" w16cid:durableId="1684016236">
+  <w:num w:numId="2" w16cid:durableId="638650642">
     <w:abstractNumId w:val="1"/>
   </w:num>
-  <w:num w:numId="3" w16cid:durableId="1760953744">
+  <w:num w:numId="3" w16cid:durableId="1599755933">
+    <w:abstractNumId w:val="2"/>
+    <w:lvlOverride w:ilvl="0">
+      <w:startOverride w:val="1"/>
+    </w:lvlOverride>
+    <w:lvlOverride w:ilvl="1">
+      <w:startOverride w:val="1"/>
+    </w:lvlOverride>
+    <w:lvlOverride w:ilvl="2">
+      <w:startOverride w:val="1"/>
+    </w:lvlOverride>
+    <w:lvlOverride w:ilvl="3">
+      <w:startOverride w:val="1"/>
+    </w:lvlOverride>
+    <w:lvlOverride w:ilvl="4">
+      <w:startOverride w:val="1"/>
+    </w:lvlOverride>
+    <w:lvlOverride w:ilvl="5">
+      <w:startOverride w:val="1"/>
+    </w:lvlOverride>
+    <w:lvlOverride w:ilvl="6">
+      <w:startOverride w:val="1"/>
+    </w:lvlOverride>
+    <w:lvlOverride w:ilvl="7">
+      <w:startOverride w:val="1"/>
+    </w:lvlOverride>
+    <w:lvlOverride w:ilvl="8">
+      <w:startOverride w:val="1"/>
+    </w:lvlOverride>
+  </w:num>
+  <w:num w:numId="4" w16cid:durableId="342705090">
     <w:abstractNumId w:val="1"/>
   </w:num>
-  <w:num w:numId="4" w16cid:durableId="1597900218">
+  <w:num w:numId="5" w16cid:durableId="738553738">
+    <w:abstractNumId w:val="2"/>
+    <w:lvlOverride w:ilvl="0">
+      <w:startOverride w:val="1"/>
+    </w:lvlOverride>
+    <w:lvlOverride w:ilvl="1">
+      <w:startOverride w:val="1"/>
+    </w:lvlOverride>
+    <w:lvlOverride w:ilvl="2">
+      <w:startOverride w:val="1"/>
+    </w:lvlOverride>
+    <w:lvlOverride w:ilvl="3">
+      <w:startOverride w:val="1"/>
+    </w:lvlOverride>
+    <w:lvlOverride w:ilvl="4">
+      <w:startOverride w:val="1"/>
+    </w:lvlOverride>
+    <w:lvlOverride w:ilvl="5">
+      <w:startOverride w:val="1"/>
+    </w:lvlOverride>
+    <w:lvlOverride w:ilvl="6">
+      <w:startOverride w:val="1"/>
+    </w:lvlOverride>
+    <w:lvlOverride w:ilvl="7">
+      <w:startOverride w:val="1"/>
+    </w:lvlOverride>
+    <w:lvlOverride w:ilvl="8">
+      <w:startOverride w:val="1"/>
+    </w:lvlOverride>
+  </w:num>
+  <w:num w:numId="6" w16cid:durableId="272519746">
+    <w:abstractNumId w:val="1"/>
+  </w:num>
+  <w:num w:numId="7" w16cid:durableId="1705446293">
+    <w:abstractNumId w:val="1"/>
+  </w:num>
+  <w:num w:numId="8" w16cid:durableId="1811315249">
+    <w:abstractNumId w:val="1"/>
+  </w:num>
+  <w:num w:numId="9" w16cid:durableId="1615866973">
     <w:abstractNumId w:val="1"/>
   </w:num>
 </w:numbering>
@@ -2214,11 +5306,11 @@
       <w:sz w:val="22"/>
     </w:rPr>
   </w:style>
-  <w:style w:type="table" w:styleId="GridTable3-Accent4">
-    <w:name w:val="Grid Table 3 Accent 4"/>
+  <w:style w:type="table" w:styleId="GridTable1Light-Accent3">
+    <w:name w:val="Grid Table 1 Light Accent 3"/>
     <w:basedOn w:val="TableNormal"/>
-    <w:uiPriority w:val="48"/>
-    <w:rsid w:val="007D245B"/>
+    <w:uiPriority w:val="46"/>
+    <w:rsid w:val="00A67E49"/>
     <w:pPr>
       <w:spacing w:after="0"/>
     </w:pPr>
@@ -2226,12 +5318,12 @@
       <w:tblStyleRowBandSize w:val="1"/>
       <w:tblStyleColBandSize w:val="1"/>
       <w:tblBorders>
-        <w:top w:val="single" w:sz="4" w:space="0" w:color="60CAF3" w:themeColor="accent4" w:themeTint="99"/>
-        <w:left w:val="single" w:sz="4" w:space="0" w:color="60CAF3" w:themeColor="accent4" w:themeTint="99"/>
-        <w:bottom w:val="single" w:sz="4" w:space="0" w:color="60CAF3" w:themeColor="accent4" w:themeTint="99"/>
-        <w:right w:val="single" w:sz="4" w:space="0" w:color="60CAF3" w:themeColor="accent4" w:themeTint="99"/>
-        <w:insideH w:val="single" w:sz="4" w:space="0" w:color="60CAF3" w:themeColor="accent4" w:themeTint="99"/>
-        <w:insideV w:val="single" w:sz="4" w:space="0" w:color="60CAF3" w:themeColor="accent4" w:themeTint="99"/>
+        <w:top w:val="single" w:sz="4" w:space="0" w:color="84E290" w:themeColor="accent3" w:themeTint="66"/>
+        <w:left w:val="single" w:sz="4" w:space="0" w:color="84E290" w:themeColor="accent3" w:themeTint="66"/>
+        <w:bottom w:val="single" w:sz="4" w:space="0" w:color="84E290" w:themeColor="accent3" w:themeTint="66"/>
+        <w:right w:val="single" w:sz="4" w:space="0" w:color="84E290" w:themeColor="accent3" w:themeTint="66"/>
+        <w:insideH w:val="single" w:sz="4" w:space="0" w:color="84E290" w:themeColor="accent3" w:themeTint="66"/>
+        <w:insideV w:val="single" w:sz="4" w:space="0" w:color="84E290" w:themeColor="accent3" w:themeTint="66"/>
       </w:tblBorders>
     </w:tblPr>
     <w:tblStylePr w:type="firstRow">
@@ -2242,143 +5334,7 @@
       <w:tblPr/>
       <w:tcPr>
         <w:tcBorders>
-          <w:top w:val="nil"/>
-          <w:left w:val="nil"/>
-          <w:right w:val="nil"/>
-          <w:insideH w:val="nil"/>
-          <w:insideV w:val="nil"/>
-        </w:tcBorders>
-        <w:shd w:val="clear" w:color="auto" w:fill="FFFFFF" w:themeFill="background1"/>
-      </w:tcPr>
-    </w:tblStylePr>
-    <w:tblStylePr w:type="lastRow">
-      <w:rPr>
-        <w:b/>
-        <w:bCs/>
-      </w:rPr>
-      <w:tblPr/>
-      <w:tcPr>
-        <w:tcBorders>
-          <w:left w:val="nil"/>
-          <w:bottom w:val="nil"/>
-          <w:right w:val="nil"/>
-          <w:insideH w:val="nil"/>
-          <w:insideV w:val="nil"/>
-        </w:tcBorders>
-        <w:shd w:val="clear" w:color="auto" w:fill="FFFFFF" w:themeFill="background1"/>
-      </w:tcPr>
-    </w:tblStylePr>
-    <w:tblStylePr w:type="firstCol">
-      <w:pPr>
-        <w:jc w:val="right"/>
-      </w:pPr>
-      <w:rPr>
-        <w:i/>
-        <w:iCs/>
-      </w:rPr>
-      <w:tblPr/>
-      <w:tcPr>
-        <w:tcBorders>
-          <w:top w:val="nil"/>
-          <w:left w:val="nil"/>
-          <w:bottom w:val="nil"/>
-          <w:insideH w:val="nil"/>
-          <w:insideV w:val="nil"/>
-        </w:tcBorders>
-        <w:shd w:val="clear" w:color="auto" w:fill="FFFFFF" w:themeFill="background1"/>
-      </w:tcPr>
-    </w:tblStylePr>
-    <w:tblStylePr w:type="lastCol">
-      <w:rPr>
-        <w:i/>
-        <w:iCs/>
-      </w:rPr>
-      <w:tblPr/>
-      <w:tcPr>
-        <w:tcBorders>
-          <w:top w:val="nil"/>
-          <w:bottom w:val="nil"/>
-          <w:right w:val="nil"/>
-          <w:insideH w:val="nil"/>
-          <w:insideV w:val="nil"/>
-        </w:tcBorders>
-        <w:shd w:val="clear" w:color="auto" w:fill="FFFFFF" w:themeFill="background1"/>
-      </w:tcPr>
-    </w:tblStylePr>
-    <w:tblStylePr w:type="band1Vert">
-      <w:tblPr/>
-      <w:tcPr>
-        <w:shd w:val="clear" w:color="auto" w:fill="CAEDFB" w:themeFill="accent4" w:themeFillTint="33"/>
-      </w:tcPr>
-    </w:tblStylePr>
-    <w:tblStylePr w:type="band1Horz">
-      <w:tblPr/>
-      <w:tcPr>
-        <w:shd w:val="clear" w:color="auto" w:fill="CAEDFB" w:themeFill="accent4" w:themeFillTint="33"/>
-      </w:tcPr>
-    </w:tblStylePr>
-    <w:tblStylePr w:type="neCell">
-      <w:tblPr/>
-      <w:tcPr>
-        <w:tcBorders>
-          <w:bottom w:val="single" w:sz="4" w:space="0" w:color="60CAF3" w:themeColor="accent4" w:themeTint="99"/>
-        </w:tcBorders>
-      </w:tcPr>
-    </w:tblStylePr>
-    <w:tblStylePr w:type="nwCell">
-      <w:tblPr/>
-      <w:tcPr>
-        <w:tcBorders>
-          <w:bottom w:val="single" w:sz="4" w:space="0" w:color="60CAF3" w:themeColor="accent4" w:themeTint="99"/>
-        </w:tcBorders>
-      </w:tcPr>
-    </w:tblStylePr>
-    <w:tblStylePr w:type="seCell">
-      <w:tblPr/>
-      <w:tcPr>
-        <w:tcBorders>
-          <w:top w:val="single" w:sz="4" w:space="0" w:color="60CAF3" w:themeColor="accent4" w:themeTint="99"/>
-        </w:tcBorders>
-      </w:tcPr>
-    </w:tblStylePr>
-    <w:tblStylePr w:type="swCell">
-      <w:tblPr/>
-      <w:tcPr>
-        <w:tcBorders>
-          <w:top w:val="single" w:sz="4" w:space="0" w:color="60CAF3" w:themeColor="accent4" w:themeTint="99"/>
-        </w:tcBorders>
-      </w:tcPr>
-    </w:tblStylePr>
-  </w:style>
-  <w:style w:type="table" w:styleId="GridTable1Light-Accent6">
-    <w:name w:val="Grid Table 1 Light Accent 6"/>
-    <w:basedOn w:val="TableNormal"/>
-    <w:uiPriority w:val="46"/>
-    <w:rsid w:val="007D245B"/>
-    <w:pPr>
-      <w:spacing w:after="0"/>
-    </w:pPr>
-    <w:tblPr>
-      <w:tblStyleRowBandSize w:val="1"/>
-      <w:tblStyleColBandSize w:val="1"/>
-      <w:tblBorders>
-        <w:top w:val="single" w:sz="4" w:space="0" w:color="B3E5A1" w:themeColor="accent6" w:themeTint="66"/>
-        <w:left w:val="single" w:sz="4" w:space="0" w:color="B3E5A1" w:themeColor="accent6" w:themeTint="66"/>
-        <w:bottom w:val="single" w:sz="4" w:space="0" w:color="B3E5A1" w:themeColor="accent6" w:themeTint="66"/>
-        <w:right w:val="single" w:sz="4" w:space="0" w:color="B3E5A1" w:themeColor="accent6" w:themeTint="66"/>
-        <w:insideH w:val="single" w:sz="4" w:space="0" w:color="B3E5A1" w:themeColor="accent6" w:themeTint="66"/>
-        <w:insideV w:val="single" w:sz="4" w:space="0" w:color="B3E5A1" w:themeColor="accent6" w:themeTint="66"/>
-      </w:tblBorders>
-    </w:tblPr>
-    <w:tblStylePr w:type="firstRow">
-      <w:rPr>
-        <w:b/>
-        <w:bCs/>
-      </w:rPr>
-      <w:tblPr/>
-      <w:tcPr>
-        <w:tcBorders>
-          <w:bottom w:val="single" w:sz="12" w:space="0" w:color="8DD873" w:themeColor="accent6" w:themeTint="99"/>
+          <w:bottom w:val="single" w:sz="12" w:space="0" w:color="47D459" w:themeColor="accent3" w:themeTint="99"/>
         </w:tcBorders>
       </w:tcPr>
     </w:tblStylePr>
@@ -2390,7 +5346,7 @@
       <w:tblPr/>
       <w:tcPr>
         <w:tcBorders>
-          <w:top w:val="double" w:sz="2" w:space="0" w:color="8DD873" w:themeColor="accent6" w:themeTint="99"/>
+          <w:top w:val="double" w:sz="2" w:space="0" w:color="47D459" w:themeColor="accent3" w:themeTint="99"/>
         </w:tcBorders>
       </w:tcPr>
     </w:tblStylePr>

</xml_diff>